<commit_message>
Elaborated, updated, clairified doc
</commit_message>
<xml_diff>
--- a/manuscript.docx
+++ b/manuscript.docx
@@ -23,7 +23,7 @@
         <w:pStyle w:val="Date"/>
       </w:pPr>
       <w:r>
-        <w:t xml:space="preserve">2026-02-13</w:t>
+        <w:t xml:space="preserve">2026-02-24</w:t>
       </w:r>
     </w:p>
     <w:sdt>
@@ -1651,7 +1651,7 @@
                 <w:rPr>
                   <w:rStyle w:val="Hyperlink"/>
                 </w:rPr>
-                <w:t xml:space="preserve">Section 4</w:t>
+                <w:t xml:space="preserve">Section 5</w:t>
               </w:r>
             </w:hyperlink>
             <w:r>
@@ -7507,22 +7507,1736 @@
     </w:tbl>
     <w:bookmarkEnd w:id="77"/>
     <w:bookmarkEnd w:id="78"/>
-    <w:bookmarkStart w:id="83" w:name="sec-conclusions"/>
+    <w:bookmarkStart w:id="88" w:name="sec-reproducibility"/>
     <w:p>
       <w:pPr>
         <w:pStyle w:val="Heading2"/>
       </w:pPr>
       <w:r>
-        <w:t xml:space="preserve">4 Conclusions and Recommendations</w:t>
+        <w:t xml:space="preserve">4 Demonstrating Thorough Reproducibility</w:t>
       </w:r>
     </w:p>
-    <w:bookmarkStart w:id="79" w:name="sec-summary"/>
     <w:p>
       <w:pPr>
+        <w:pStyle w:val="FirstParagraph"/>
+      </w:pPr>
+      <w:r>
+        <w:t xml:space="preserve">A key advantage of Quarto is that code and narrative can live in the same document.</w:t>
+      </w:r>
+      <w:r>
+        <w:t xml:space="preserve"> </w:t>
+      </w:r>
+      <w:r>
+        <w:t xml:space="preserve">This means we can write prose that adapts automatically when data change.</w:t>
+      </w:r>
+      <w:r>
+        <w:t xml:space="preserve"> </w:t>
+      </w:r>
+      <w:r>
+        <w:t xml:space="preserve">Rather than hard-coding a conclusion, we let the code determine what to say.</w:t>
+      </w:r>
+    </w:p>
+    <w:p>
+      <w:pPr>
+        <w:pStyle w:val="BodyText"/>
+      </w:pPr>
+      <w:r>
+        <w:t xml:space="preserve">For a deeper discussion of this principle, see</w:t>
+      </w:r>
+      <w:r>
+        <w:t xml:space="preserve"> </w:t>
+      </w:r>
+      <w:hyperlink r:id="rId79">
+        <w:r>
+          <w:rPr>
+            <w:rStyle w:val="Hyperlink"/>
+          </w:rPr>
+          <w:t xml:space="preserve">Maximizing Reproducibility</w:t>
+        </w:r>
+      </w:hyperlink>
+      <w:r>
+        <w:t xml:space="preserve">.</w:t>
+      </w:r>
+    </w:p>
+    <w:bookmarkStart w:id="83" w:name="sec-repro-best-day"/>
+    <w:p>
+      <w:pPr>
         <w:pStyle w:val="Heading3"/>
       </w:pPr>
       <w:r>
-        <w:t xml:space="preserve">4.1 Summary of Findings</w:t>
+        <w:t xml:space="preserve">4.1 Which Day Has the Highest Mean Tip?</w:t>
+      </w:r>
+    </w:p>
+    <w:p>
+      <w:pPr>
+        <w:pStyle w:val="FirstParagraph"/>
+      </w:pPr>
+      <w:r>
+        <w:t xml:space="preserve">Below, we programmatically identify the best tipping day and report the result</w:t>
+      </w:r>
+      <w:r>
+        <w:t xml:space="preserve"> </w:t>
+      </w:r>
+      <w:r>
+        <w:t xml:space="preserve">in a sentence that will remain correct even if the underlying data are filtered,</w:t>
+      </w:r>
+      <w:r>
+        <w:t xml:space="preserve"> </w:t>
+      </w:r>
+      <w:r>
+        <w:t xml:space="preserve">extended, or replaced.</w:t>
+      </w:r>
+    </w:p>
+    <w:p>
+      <w:pPr>
+        <w:pStyle w:val="SourceCode"/>
+      </w:pPr>
+      <w:r>
+        <w:rPr>
+          <w:rStyle w:val="ImportTok"/>
+        </w:rPr>
+        <w:t xml:space="preserve">from</w:t>
+      </w:r>
+      <w:r>
+        <w:rPr>
+          <w:rStyle w:val="NormalTok"/>
+        </w:rPr>
+        <w:t xml:space="preserve"> IPython.display </w:t>
+      </w:r>
+      <w:r>
+        <w:rPr>
+          <w:rStyle w:val="ImportTok"/>
+        </w:rPr>
+        <w:t xml:space="preserve">import</w:t>
+      </w:r>
+      <w:r>
+        <w:rPr>
+          <w:rStyle w:val="NormalTok"/>
+        </w:rPr>
+        <w:t xml:space="preserve"> Markdown, display</w:t>
+      </w:r>
+      <w:r>
+        <w:br/>
+      </w:r>
+      <w:r>
+        <w:br/>
+      </w:r>
+      <w:r>
+        <w:rPr>
+          <w:rStyle w:val="NormalTok"/>
+        </w:rPr>
+        <w:t xml:space="preserve">mean_tips </w:t>
+      </w:r>
+      <w:r>
+        <w:rPr>
+          <w:rStyle w:val="OperatorTok"/>
+        </w:rPr>
+        <w:t xml:space="preserve">=</w:t>
+      </w:r>
+      <w:r>
+        <w:rPr>
+          <w:rStyle w:val="NormalTok"/>
+        </w:rPr>
+        <w:t xml:space="preserve"> tips.groupby(</w:t>
+      </w:r>
+      <w:r>
+        <w:rPr>
+          <w:rStyle w:val="StringTok"/>
+        </w:rPr>
+        <w:t xml:space="preserve">"day"</w:t>
+      </w:r>
+      <w:r>
+        <w:rPr>
+          <w:rStyle w:val="NormalTok"/>
+        </w:rPr>
+        <w:t xml:space="preserve">)[</w:t>
+      </w:r>
+      <w:r>
+        <w:rPr>
+          <w:rStyle w:val="StringTok"/>
+        </w:rPr>
+        <w:t xml:space="preserve">"tip"</w:t>
+      </w:r>
+      <w:r>
+        <w:rPr>
+          <w:rStyle w:val="NormalTok"/>
+        </w:rPr>
+        <w:t xml:space="preserve">].mean()</w:t>
+      </w:r>
+      <w:r>
+        <w:br/>
+      </w:r>
+      <w:r>
+        <w:rPr>
+          <w:rStyle w:val="NormalTok"/>
+        </w:rPr>
+        <w:t xml:space="preserve">best_day </w:t>
+      </w:r>
+      <w:r>
+        <w:rPr>
+          <w:rStyle w:val="OperatorTok"/>
+        </w:rPr>
+        <w:t xml:space="preserve">=</w:t>
+      </w:r>
+      <w:r>
+        <w:rPr>
+          <w:rStyle w:val="NormalTok"/>
+        </w:rPr>
+        <w:t xml:space="preserve"> mean_tips.idxmax()</w:t>
+      </w:r>
+      <w:r>
+        <w:br/>
+      </w:r>
+      <w:r>
+        <w:rPr>
+          <w:rStyle w:val="NormalTok"/>
+        </w:rPr>
+        <w:t xml:space="preserve">best_val </w:t>
+      </w:r>
+      <w:r>
+        <w:rPr>
+          <w:rStyle w:val="OperatorTok"/>
+        </w:rPr>
+        <w:t xml:space="preserve">=</w:t>
+      </w:r>
+      <w:r>
+        <w:rPr>
+          <w:rStyle w:val="NormalTok"/>
+        </w:rPr>
+        <w:t xml:space="preserve"> mean_tips.</w:t>
+      </w:r>
+      <w:r>
+        <w:rPr>
+          <w:rStyle w:val="BuiltInTok"/>
+        </w:rPr>
+        <w:t xml:space="preserve">max</w:t>
+      </w:r>
+      <w:r>
+        <w:rPr>
+          <w:rStyle w:val="NormalTok"/>
+        </w:rPr>
+        <w:t xml:space="preserve">()</w:t>
+      </w:r>
+      <w:r>
+        <w:br/>
+      </w:r>
+      <w:r>
+        <w:rPr>
+          <w:rStyle w:val="NormalTok"/>
+        </w:rPr>
+        <w:t xml:space="preserve">worst_day </w:t>
+      </w:r>
+      <w:r>
+        <w:rPr>
+          <w:rStyle w:val="OperatorTok"/>
+        </w:rPr>
+        <w:t xml:space="preserve">=</w:t>
+      </w:r>
+      <w:r>
+        <w:rPr>
+          <w:rStyle w:val="NormalTok"/>
+        </w:rPr>
+        <w:t xml:space="preserve"> mean_tips.idxmin()</w:t>
+      </w:r>
+      <w:r>
+        <w:br/>
+      </w:r>
+      <w:r>
+        <w:rPr>
+          <w:rStyle w:val="NormalTok"/>
+        </w:rPr>
+        <w:t xml:space="preserve">worst_val </w:t>
+      </w:r>
+      <w:r>
+        <w:rPr>
+          <w:rStyle w:val="OperatorTok"/>
+        </w:rPr>
+        <w:t xml:space="preserve">=</w:t>
+      </w:r>
+      <w:r>
+        <w:rPr>
+          <w:rStyle w:val="NormalTok"/>
+        </w:rPr>
+        <w:t xml:space="preserve"> mean_tips.</w:t>
+      </w:r>
+      <w:r>
+        <w:rPr>
+          <w:rStyle w:val="BuiltInTok"/>
+        </w:rPr>
+        <w:t xml:space="preserve">min</w:t>
+      </w:r>
+      <w:r>
+        <w:rPr>
+          <w:rStyle w:val="NormalTok"/>
+        </w:rPr>
+        <w:t xml:space="preserve">()</w:t>
+      </w:r>
+      <w:r>
+        <w:br/>
+      </w:r>
+      <w:r>
+        <w:br/>
+      </w:r>
+      <w:r>
+        <w:rPr>
+          <w:rStyle w:val="NormalTok"/>
+        </w:rPr>
+        <w:t xml:space="preserve">narrative </w:t>
+      </w:r>
+      <w:r>
+        <w:rPr>
+          <w:rStyle w:val="OperatorTok"/>
+        </w:rPr>
+        <w:t xml:space="preserve">=</w:t>
+      </w:r>
+      <w:r>
+        <w:rPr>
+          <w:rStyle w:val="NormalTok"/>
+        </w:rPr>
+        <w:t xml:space="preserve"> (</w:t>
+      </w:r>
+      <w:r>
+        <w:br/>
+      </w:r>
+      <w:r>
+        <w:rPr>
+          <w:rStyle w:val="NormalTok"/>
+        </w:rPr>
+        <w:t xml:space="preserve">    </w:t>
+      </w:r>
+      <w:r>
+        <w:rPr>
+          <w:rStyle w:val="SpecialStringTok"/>
+        </w:rPr>
+        <w:t xml:space="preserve">f"Among the four days in the dataset, </w:t>
+      </w:r>
+      <w:r>
+        <w:rPr>
+          <w:rStyle w:val="SpecialCharTok"/>
+        </w:rPr>
+        <w:t xml:space="preserve">{</w:t>
+      </w:r>
+      <w:r>
+        <w:rPr>
+          <w:rStyle w:val="NormalTok"/>
+        </w:rPr>
+        <w:t xml:space="preserve">best_day</w:t>
+      </w:r>
+      <w:r>
+        <w:rPr>
+          <w:rStyle w:val="SpecialCharTok"/>
+        </w:rPr>
+        <w:t xml:space="preserve">}</w:t>
+      </w:r>
+      <w:r>
+        <w:rPr>
+          <w:rStyle w:val="SpecialStringTok"/>
+        </w:rPr>
+        <w:t xml:space="preserve"> has the highest "</w:t>
+      </w:r>
+      <w:r>
+        <w:br/>
+      </w:r>
+      <w:r>
+        <w:rPr>
+          <w:rStyle w:val="NormalTok"/>
+        </w:rPr>
+        <w:t xml:space="preserve">    </w:t>
+      </w:r>
+      <w:r>
+        <w:rPr>
+          <w:rStyle w:val="SpecialStringTok"/>
+        </w:rPr>
+        <w:t xml:space="preserve">f"mean tip at $</w:t>
+      </w:r>
+      <w:r>
+        <w:rPr>
+          <w:rStyle w:val="SpecialCharTok"/>
+        </w:rPr>
+        <w:t xml:space="preserve">{</w:t>
+      </w:r>
+      <w:r>
+        <w:rPr>
+          <w:rStyle w:val="NormalTok"/>
+        </w:rPr>
+        <w:t xml:space="preserve">best_val</w:t>
+      </w:r>
+      <w:r>
+        <w:rPr>
+          <w:rStyle w:val="SpecialCharTok"/>
+        </w:rPr>
+        <w:t xml:space="preserve">:.2f}</w:t>
+      </w:r>
+      <w:r>
+        <w:rPr>
+          <w:rStyle w:val="SpecialStringTok"/>
+        </w:rPr>
+        <w:t xml:space="preserve">, while </w:t>
+      </w:r>
+      <w:r>
+        <w:rPr>
+          <w:rStyle w:val="SpecialCharTok"/>
+        </w:rPr>
+        <w:t xml:space="preserve">{</w:t>
+      </w:r>
+      <w:r>
+        <w:rPr>
+          <w:rStyle w:val="NormalTok"/>
+        </w:rPr>
+        <w:t xml:space="preserve">worst_day</w:t>
+      </w:r>
+      <w:r>
+        <w:rPr>
+          <w:rStyle w:val="SpecialCharTok"/>
+        </w:rPr>
+        <w:t xml:space="preserve">}</w:t>
+      </w:r>
+      <w:r>
+        <w:rPr>
+          <w:rStyle w:val="SpecialStringTok"/>
+        </w:rPr>
+        <w:t xml:space="preserve"> has the lowest "</w:t>
+      </w:r>
+      <w:r>
+        <w:br/>
+      </w:r>
+      <w:r>
+        <w:rPr>
+          <w:rStyle w:val="NormalTok"/>
+        </w:rPr>
+        <w:t xml:space="preserve">    </w:t>
+      </w:r>
+      <w:r>
+        <w:rPr>
+          <w:rStyle w:val="SpecialStringTok"/>
+        </w:rPr>
+        <w:t xml:space="preserve">f"at $</w:t>
+      </w:r>
+      <w:r>
+        <w:rPr>
+          <w:rStyle w:val="SpecialCharTok"/>
+        </w:rPr>
+        <w:t xml:space="preserve">{</w:t>
+      </w:r>
+      <w:r>
+        <w:rPr>
+          <w:rStyle w:val="NormalTok"/>
+        </w:rPr>
+        <w:t xml:space="preserve">worst_val</w:t>
+      </w:r>
+      <w:r>
+        <w:rPr>
+          <w:rStyle w:val="SpecialCharTok"/>
+        </w:rPr>
+        <w:t xml:space="preserve">:.2f}</w:t>
+      </w:r>
+      <w:r>
+        <w:rPr>
+          <w:rStyle w:val="SpecialStringTok"/>
+        </w:rPr>
+        <w:t xml:space="preserve">. "</w:t>
+      </w:r>
+      <w:r>
+        <w:br/>
+      </w:r>
+      <w:r>
+        <w:rPr>
+          <w:rStyle w:val="NormalTok"/>
+        </w:rPr>
+        <w:t xml:space="preserve">)</w:t>
+      </w:r>
+      <w:r>
+        <w:br/>
+      </w:r>
+      <w:r>
+        <w:br/>
+      </w:r>
+      <w:r>
+        <w:rPr>
+          <w:rStyle w:val="NormalTok"/>
+        </w:rPr>
+        <w:t xml:space="preserve">diff </w:t>
+      </w:r>
+      <w:r>
+        <w:rPr>
+          <w:rStyle w:val="OperatorTok"/>
+        </w:rPr>
+        <w:t xml:space="preserve">=</w:t>
+      </w:r>
+      <w:r>
+        <w:rPr>
+          <w:rStyle w:val="NormalTok"/>
+        </w:rPr>
+        <w:t xml:space="preserve"> best_val </w:t>
+      </w:r>
+      <w:r>
+        <w:rPr>
+          <w:rStyle w:val="OperatorTok"/>
+        </w:rPr>
+        <w:t xml:space="preserve">-</w:t>
+      </w:r>
+      <w:r>
+        <w:rPr>
+          <w:rStyle w:val="NormalTok"/>
+        </w:rPr>
+        <w:t xml:space="preserve"> worst_val</w:t>
+      </w:r>
+      <w:r>
+        <w:br/>
+      </w:r>
+      <w:r>
+        <w:rPr>
+          <w:rStyle w:val="ControlFlowTok"/>
+        </w:rPr>
+        <w:t xml:space="preserve">if</w:t>
+      </w:r>
+      <w:r>
+        <w:rPr>
+          <w:rStyle w:val="NormalTok"/>
+        </w:rPr>
+        <w:t xml:space="preserve"> diff </w:t>
+      </w:r>
+      <w:r>
+        <w:rPr>
+          <w:rStyle w:val="OperatorTok"/>
+        </w:rPr>
+        <w:t xml:space="preserve">&gt;</w:t>
+      </w:r>
+      <w:r>
+        <w:rPr>
+          <w:rStyle w:val="NormalTok"/>
+        </w:rPr>
+        <w:t xml:space="preserve"> </w:t>
+      </w:r>
+      <w:r>
+        <w:rPr>
+          <w:rStyle w:val="FloatTok"/>
+        </w:rPr>
+        <w:t xml:space="preserve">0.50</w:t>
+      </w:r>
+      <w:r>
+        <w:rPr>
+          <w:rStyle w:val="NormalTok"/>
+        </w:rPr>
+        <w:t xml:space="preserve">:</w:t>
+      </w:r>
+      <w:r>
+        <w:br/>
+      </w:r>
+      <w:r>
+        <w:rPr>
+          <w:rStyle w:val="NormalTok"/>
+        </w:rPr>
+        <w:t xml:space="preserve">    narrative </w:t>
+      </w:r>
+      <w:r>
+        <w:rPr>
+          <w:rStyle w:val="OperatorTok"/>
+        </w:rPr>
+        <w:t xml:space="preserve">+=</w:t>
+      </w:r>
+      <w:r>
+        <w:rPr>
+          <w:rStyle w:val="NormalTok"/>
+        </w:rPr>
+        <w:t xml:space="preserve"> (</w:t>
+      </w:r>
+      <w:r>
+        <w:br/>
+      </w:r>
+      <w:r>
+        <w:rPr>
+          <w:rStyle w:val="NormalTok"/>
+        </w:rPr>
+        <w:t xml:space="preserve">        </w:t>
+      </w:r>
+      <w:r>
+        <w:rPr>
+          <w:rStyle w:val="SpecialStringTok"/>
+        </w:rPr>
+        <w:t xml:space="preserve">f"The difference of $</w:t>
+      </w:r>
+      <w:r>
+        <w:rPr>
+          <w:rStyle w:val="SpecialCharTok"/>
+        </w:rPr>
+        <w:t xml:space="preserve">{</w:t>
+      </w:r>
+      <w:r>
+        <w:rPr>
+          <w:rStyle w:val="NormalTok"/>
+        </w:rPr>
+        <w:t xml:space="preserve">diff</w:t>
+      </w:r>
+      <w:r>
+        <w:rPr>
+          <w:rStyle w:val="SpecialCharTok"/>
+        </w:rPr>
+        <w:t xml:space="preserve">:.2f}</w:t>
+      </w:r>
+      <w:r>
+        <w:rPr>
+          <w:rStyle w:val="SpecialStringTok"/>
+        </w:rPr>
+        <w:t xml:space="preserve"> is notable and may warrant further "</w:t>
+      </w:r>
+      <w:r>
+        <w:br/>
+      </w:r>
+      <w:r>
+        <w:rPr>
+          <w:rStyle w:val="NormalTok"/>
+        </w:rPr>
+        <w:t xml:space="preserve">        </w:t>
+      </w:r>
+      <w:r>
+        <w:rPr>
+          <w:rStyle w:val="SpecialStringTok"/>
+        </w:rPr>
+        <w:t xml:space="preserve">f"investigation into what drives higher spending on </w:t>
+      </w:r>
+      <w:r>
+        <w:rPr>
+          <w:rStyle w:val="SpecialCharTok"/>
+        </w:rPr>
+        <w:t xml:space="preserve">{</w:t>
+      </w:r>
+      <w:r>
+        <w:rPr>
+          <w:rStyle w:val="NormalTok"/>
+        </w:rPr>
+        <w:t xml:space="preserve">best_day</w:t>
+      </w:r>
+      <w:r>
+        <w:rPr>
+          <w:rStyle w:val="SpecialCharTok"/>
+        </w:rPr>
+        <w:t xml:space="preserve">}</w:t>
+      </w:r>
+      <w:r>
+        <w:rPr>
+          <w:rStyle w:val="SpecialStringTok"/>
+        </w:rPr>
+        <w:t xml:space="preserve">."</w:t>
+      </w:r>
+      <w:r>
+        <w:br/>
+      </w:r>
+      <w:r>
+        <w:rPr>
+          <w:rStyle w:val="NormalTok"/>
+        </w:rPr>
+        <w:t xml:space="preserve">    )</w:t>
+      </w:r>
+      <w:r>
+        <w:br/>
+      </w:r>
+      <w:r>
+        <w:rPr>
+          <w:rStyle w:val="ControlFlowTok"/>
+        </w:rPr>
+        <w:t xml:space="preserve">else</w:t>
+      </w:r>
+      <w:r>
+        <w:rPr>
+          <w:rStyle w:val="NormalTok"/>
+        </w:rPr>
+        <w:t xml:space="preserve">:</w:t>
+      </w:r>
+      <w:r>
+        <w:br/>
+      </w:r>
+      <w:r>
+        <w:rPr>
+          <w:rStyle w:val="NormalTok"/>
+        </w:rPr>
+        <w:t xml:space="preserve">    narrative </w:t>
+      </w:r>
+      <w:r>
+        <w:rPr>
+          <w:rStyle w:val="OperatorTok"/>
+        </w:rPr>
+        <w:t xml:space="preserve">+=</w:t>
+      </w:r>
+      <w:r>
+        <w:rPr>
+          <w:rStyle w:val="NormalTok"/>
+        </w:rPr>
+        <w:t xml:space="preserve"> (</w:t>
+      </w:r>
+      <w:r>
+        <w:br/>
+      </w:r>
+      <w:r>
+        <w:rPr>
+          <w:rStyle w:val="NormalTok"/>
+        </w:rPr>
+        <w:t xml:space="preserve">        </w:t>
+      </w:r>
+      <w:r>
+        <w:rPr>
+          <w:rStyle w:val="SpecialStringTok"/>
+        </w:rPr>
+        <w:t xml:space="preserve">f"The difference of $</w:t>
+      </w:r>
+      <w:r>
+        <w:rPr>
+          <w:rStyle w:val="SpecialCharTok"/>
+        </w:rPr>
+        <w:t xml:space="preserve">{</w:t>
+      </w:r>
+      <w:r>
+        <w:rPr>
+          <w:rStyle w:val="NormalTok"/>
+        </w:rPr>
+        <w:t xml:space="preserve">diff</w:t>
+      </w:r>
+      <w:r>
+        <w:rPr>
+          <w:rStyle w:val="SpecialCharTok"/>
+        </w:rPr>
+        <w:t xml:space="preserve">:.2f}</w:t>
+      </w:r>
+      <w:r>
+        <w:rPr>
+          <w:rStyle w:val="SpecialStringTok"/>
+        </w:rPr>
+        <w:t xml:space="preserve"> is modest, suggesting that day of "</w:t>
+      </w:r>
+      <w:r>
+        <w:br/>
+      </w:r>
+      <w:r>
+        <w:rPr>
+          <w:rStyle w:val="NormalTok"/>
+        </w:rPr>
+        <w:t xml:space="preserve">        </w:t>
+      </w:r>
+      <w:r>
+        <w:rPr>
+          <w:rStyle w:val="SpecialStringTok"/>
+        </w:rPr>
+        <w:t xml:space="preserve">f"the week alone is not a strong predictor of tip amount."</w:t>
+      </w:r>
+      <w:r>
+        <w:br/>
+      </w:r>
+      <w:r>
+        <w:rPr>
+          <w:rStyle w:val="NormalTok"/>
+        </w:rPr>
+        <w:t xml:space="preserve">    )</w:t>
+      </w:r>
+      <w:r>
+        <w:br/>
+      </w:r>
+      <w:r>
+        <w:br/>
+      </w:r>
+      <w:r>
+        <w:rPr>
+          <w:rStyle w:val="NormalTok"/>
+        </w:rPr>
+        <w:t xml:space="preserve">display(Markdown(narrative))</w:t>
+      </w:r>
+    </w:p>
+    <w:bookmarkStart w:id="80" w:name="repro-best-day"/>
+    <w:p>
+      <w:pPr>
+        <w:pStyle w:val="FirstParagraph"/>
+      </w:pPr>
+      <w:r>
+        <w:t xml:space="preserve">Among the four days in the dataset, Sun has the highest mean tip at $3.26, while Fri has the lowest at $2.73. The difference of $0.52 is notable and may warrant further investigation into what drives higher spending on Sun.</w:t>
+      </w:r>
+    </w:p>
+    <w:bookmarkEnd w:id="80"/>
+    <w:tbl>
+      <w:tblPr>
+        <w:tblStyle w:val="Table"/>
+        <w:tblLook w:firstRow="0" w:lastRow="0" w:firstColumn="0" w:lastColumn="0" w:noHBand="0" w:noVBand="0" w:val="0000"/>
+        <w:tblBorders>
+          <w:left w:val="single" w:sz="24" w:space="0" w:color="00A047"/>
+          <w:right w:val="single" w:sz="4" w:space="0" w:color="00A047"/>
+          <w:top w:val="single" w:sz="4" w:space="0" w:color="00A047"/>
+          <w:bottom w:val="single" w:sz="4" w:space="0" w:color="00A047"/>
+        </w:tblBorders>
+        <w:tblCellMar>
+          <w:left w:w="144" w:type="dxa"/>
+          <w:right w:w="144" w:type="dxa"/>
+        </w:tblCellMar>
+        <w:tblInd w:w="164" w:type="dxa"/>
+        <w:tblW w:type="pct" w:w="100%"/>
+      </w:tblPr>
+      <w:tr>
+        <w:trPr>
+          <w:cantSplit/>
+        </w:trPr>
+        <w:tc>
+          <w:tcPr>
+            <w:shd w:color="auto" w:fill="ccf1e3" w:val="clear"/>
+            <w:tcMar>
+              <w:top w:w="92" w:type="dxa"/>
+              <w:bottom w:w="92" w:type="dxa"/>
+            </w:tcMar>
+          </w:tcPr>
+          <w:p>
+            <w:pPr>
+              <w:pStyle w:val="BodyText"/>
+            </w:pPr>
+            <w:pPr>
+              <w:spacing w:before="0" w:after="0"/>
+              <w:textAlignment w:val="center"/>
+            </w:pPr>
+            <w:r>
+              <w:drawing>
+                <wp:inline>
+                  <wp:extent cx="152400" cy="152400"/>
+                  <wp:effectExtent b="0" l="0" r="0" t="0"/>
+                  <wp:docPr descr="" title="" id="81" name="Picture"/>
+                  <a:graphic>
+                    <a:graphicData uri="http://schemas.openxmlformats.org/drawingml/2006/picture">
+                      <pic:pic>
+                        <pic:nvPicPr>
+                          <pic:cNvPr descr="/Applications/quarto/share/formats/docx/tip.png" id="82" name="Picture"/>
+                          <pic:cNvPicPr>
+                            <a:picLocks noChangeArrowheads="1" noChangeAspect="1"/>
+                          </pic:cNvPicPr>
+                        </pic:nvPicPr>
+                        <pic:blipFill>
+                          <a:blip r:embed="rId25"/>
+                          <a:stretch>
+                            <a:fillRect/>
+                          </a:stretch>
+                        </pic:blipFill>
+                        <pic:spPr bwMode="auto">
+                          <a:xfrm>
+                            <a:off x="0" y="0"/>
+                            <a:ext cx="152400" cy="152400"/>
+                          </a:xfrm>
+                          <a:prstGeom prst="rect">
+                            <a:avLst/>
+                          </a:prstGeom>
+                          <a:noFill/>
+                          <a:ln w="9525">
+                            <a:noFill/>
+                            <a:headEnd/>
+                            <a:tailEnd/>
+                          </a:ln>
+                        </pic:spPr>
+                      </pic:pic>
+                    </a:graphicData>
+                  </a:graphic>
+                </wp:inline>
+              </w:drawing>
+            </w:r>
+            <w:r>
+              <w:t xml:space="preserve"> </w:t>
+            </w:r>
+            <w:r>
+              <w:t xml:space="preserve"> </w:t>
+            </w:r>
+            <w:r>
+              <w:t xml:space="preserve">Why This Matters</w:t>
+            </w:r>
+          </w:p>
+        </w:tc>
+      </w:tr>
+      <w:tr>
+        <w:trPr>
+          <w:cantSplit/>
+        </w:trPr>
+        <w:tc>
+          <w:tcPr>
+            <w:tcMar>
+              <w:top w:w="108" w:type="dxa"/>
+              <w:bottom w:w="108" w:type="dxa"/>
+            </w:tcMar>
+          </w:tcPr>
+          <w:p>
+            <w:pPr>
+              <w:pStyle w:val="BodyText"/>
+            </w:pPr>
+            <w:pPr>
+              <w:spacing w:before="16" w:after="16"/>
+            </w:pPr>
+            <w:r>
+              <w:t xml:space="preserve">The paragraph above is not typed by hand. It is generated by the code block.</w:t>
+            </w:r>
+            <w:r>
+              <w:t xml:space="preserve"> </w:t>
+            </w:r>
+            <w:r>
+              <w:t xml:space="preserve">If the dataset changes—say, Friday observations are removed or new data are</w:t>
+            </w:r>
+            <w:r>
+              <w:t xml:space="preserve"> </w:t>
+            </w:r>
+            <w:r>
+              <w:t xml:space="preserve">appended—the sentence rewrites itself on the next render. No manual editing</w:t>
+            </w:r>
+            <w:r>
+              <w:t xml:space="preserve"> </w:t>
+            </w:r>
+            <w:r>
+              <w:t xml:space="preserve">required.</w:t>
+            </w:r>
+          </w:p>
+        </w:tc>
+      </w:tr>
+    </w:tbl>
+    <w:bookmarkEnd w:id="83"/>
+    <w:bookmarkStart w:id="87" w:name="sec-repro-chi2"/>
+    <w:p>
+      <w:pPr>
+        <w:pStyle w:val="Heading3"/>
+      </w:pPr>
+      <w:r>
+        <w:t xml:space="preserve">4.2 Is Tipping Behavior Independent of Day?</w:t>
+      </w:r>
+    </w:p>
+    <w:p>
+      <w:pPr>
+        <w:pStyle w:val="FirstParagraph"/>
+      </w:pPr>
+      <w:r>
+        <w:t xml:space="preserve">We can apply the same principle to a statistical test. A chi-squared test</w:t>
+      </w:r>
+      <w:r>
+        <w:t xml:space="preserve"> </w:t>
+      </w:r>
+      <w:r>
+        <w:t xml:space="preserve">evaluates whether the distribution of tip quality (above or below median)</w:t>
+      </w:r>
+      <w:r>
+        <w:t xml:space="preserve"> </w:t>
+      </w:r>
+      <w:r>
+        <w:t xml:space="preserve">is independent of the day of the week.</w:t>
+      </w:r>
+    </w:p>
+    <w:p>
+      <w:pPr>
+        <w:pStyle w:val="SourceCode"/>
+      </w:pPr>
+      <w:r>
+        <w:rPr>
+          <w:rStyle w:val="ImportTok"/>
+        </w:rPr>
+        <w:t xml:space="preserve">from</w:t>
+      </w:r>
+      <w:r>
+        <w:rPr>
+          <w:rStyle w:val="NormalTok"/>
+        </w:rPr>
+        <w:t xml:space="preserve"> scipy.stats </w:t>
+      </w:r>
+      <w:r>
+        <w:rPr>
+          <w:rStyle w:val="ImportTok"/>
+        </w:rPr>
+        <w:t xml:space="preserve">import</w:t>
+      </w:r>
+      <w:r>
+        <w:rPr>
+          <w:rStyle w:val="NormalTok"/>
+        </w:rPr>
+        <w:t xml:space="preserve"> chi2_contingency</w:t>
+      </w:r>
+      <w:r>
+        <w:br/>
+      </w:r>
+      <w:r>
+        <w:br/>
+      </w:r>
+      <w:r>
+        <w:rPr>
+          <w:rStyle w:val="NormalTok"/>
+        </w:rPr>
+        <w:t xml:space="preserve">tips[</w:t>
+      </w:r>
+      <w:r>
+        <w:rPr>
+          <w:rStyle w:val="StringTok"/>
+        </w:rPr>
+        <w:t xml:space="preserve">"above_median_tip"</w:t>
+      </w:r>
+      <w:r>
+        <w:rPr>
+          <w:rStyle w:val="NormalTok"/>
+        </w:rPr>
+        <w:t xml:space="preserve">] </w:t>
+      </w:r>
+      <w:r>
+        <w:rPr>
+          <w:rStyle w:val="OperatorTok"/>
+        </w:rPr>
+        <w:t xml:space="preserve">=</w:t>
+      </w:r>
+      <w:r>
+        <w:rPr>
+          <w:rStyle w:val="NormalTok"/>
+        </w:rPr>
+        <w:t xml:space="preserve"> tips[</w:t>
+      </w:r>
+      <w:r>
+        <w:rPr>
+          <w:rStyle w:val="StringTok"/>
+        </w:rPr>
+        <w:t xml:space="preserve">"tip"</w:t>
+      </w:r>
+      <w:r>
+        <w:rPr>
+          <w:rStyle w:val="NormalTok"/>
+        </w:rPr>
+        <w:t xml:space="preserve">] </w:t>
+      </w:r>
+      <w:r>
+        <w:rPr>
+          <w:rStyle w:val="OperatorTok"/>
+        </w:rPr>
+        <w:t xml:space="preserve">&gt;=</w:t>
+      </w:r>
+      <w:r>
+        <w:rPr>
+          <w:rStyle w:val="NormalTok"/>
+        </w:rPr>
+        <w:t xml:space="preserve"> tips[</w:t>
+      </w:r>
+      <w:r>
+        <w:rPr>
+          <w:rStyle w:val="StringTok"/>
+        </w:rPr>
+        <w:t xml:space="preserve">"tip"</w:t>
+      </w:r>
+      <w:r>
+        <w:rPr>
+          <w:rStyle w:val="NormalTok"/>
+        </w:rPr>
+        <w:t xml:space="preserve">].median()</w:t>
+      </w:r>
+      <w:r>
+        <w:br/>
+      </w:r>
+      <w:r>
+        <w:rPr>
+          <w:rStyle w:val="NormalTok"/>
+        </w:rPr>
+        <w:t xml:space="preserve">contingency </w:t>
+      </w:r>
+      <w:r>
+        <w:rPr>
+          <w:rStyle w:val="OperatorTok"/>
+        </w:rPr>
+        <w:t xml:space="preserve">=</w:t>
+      </w:r>
+      <w:r>
+        <w:rPr>
+          <w:rStyle w:val="NormalTok"/>
+        </w:rPr>
+        <w:t xml:space="preserve"> pd.crosstab(tips[</w:t>
+      </w:r>
+      <w:r>
+        <w:rPr>
+          <w:rStyle w:val="StringTok"/>
+        </w:rPr>
+        <w:t xml:space="preserve">"day"</w:t>
+      </w:r>
+      <w:r>
+        <w:rPr>
+          <w:rStyle w:val="NormalTok"/>
+        </w:rPr>
+        <w:t xml:space="preserve">], tips[</w:t>
+      </w:r>
+      <w:r>
+        <w:rPr>
+          <w:rStyle w:val="StringTok"/>
+        </w:rPr>
+        <w:t xml:space="preserve">"above_median_tip"</w:t>
+      </w:r>
+      <w:r>
+        <w:rPr>
+          <w:rStyle w:val="NormalTok"/>
+        </w:rPr>
+        <w:t xml:space="preserve">])</w:t>
+      </w:r>
+      <w:r>
+        <w:br/>
+      </w:r>
+      <w:r>
+        <w:rPr>
+          <w:rStyle w:val="NormalTok"/>
+        </w:rPr>
+        <w:t xml:space="preserve">chi2, p_value, dof, expected </w:t>
+      </w:r>
+      <w:r>
+        <w:rPr>
+          <w:rStyle w:val="OperatorTok"/>
+        </w:rPr>
+        <w:t xml:space="preserve">=</w:t>
+      </w:r>
+      <w:r>
+        <w:rPr>
+          <w:rStyle w:val="NormalTok"/>
+        </w:rPr>
+        <w:t xml:space="preserve"> chi2_contingency(contingency)</w:t>
+      </w:r>
+      <w:r>
+        <w:br/>
+      </w:r>
+      <w:r>
+        <w:br/>
+      </w:r>
+      <w:r>
+        <w:rPr>
+          <w:rStyle w:val="NormalTok"/>
+        </w:rPr>
+        <w:t xml:space="preserve">conclusion </w:t>
+      </w:r>
+      <w:r>
+        <w:rPr>
+          <w:rStyle w:val="OperatorTok"/>
+        </w:rPr>
+        <w:t xml:space="preserve">=</w:t>
+      </w:r>
+      <w:r>
+        <w:rPr>
+          <w:rStyle w:val="NormalTok"/>
+        </w:rPr>
+        <w:t xml:space="preserve"> (</w:t>
+      </w:r>
+      <w:r>
+        <w:br/>
+      </w:r>
+      <w:r>
+        <w:rPr>
+          <w:rStyle w:val="NormalTok"/>
+        </w:rPr>
+        <w:t xml:space="preserve">    </w:t>
+      </w:r>
+      <w:r>
+        <w:rPr>
+          <w:rStyle w:val="StringTok"/>
+        </w:rPr>
+        <w:t xml:space="preserve">"A chi-squared test of independence was conducted to determine whether "</w:t>
+      </w:r>
+      <w:r>
+        <w:br/>
+      </w:r>
+      <w:r>
+        <w:rPr>
+          <w:rStyle w:val="NormalTok"/>
+        </w:rPr>
+        <w:t xml:space="preserve">    </w:t>
+      </w:r>
+      <w:r>
+        <w:rPr>
+          <w:rStyle w:val="StringTok"/>
+        </w:rPr>
+        <w:t xml:space="preserve">"the proportion of above-median tips differs by day of the week. "</w:t>
+      </w:r>
+      <w:r>
+        <w:br/>
+      </w:r>
+      <w:r>
+        <w:rPr>
+          <w:rStyle w:val="NormalTok"/>
+        </w:rPr>
+        <w:t xml:space="preserve">)</w:t>
+      </w:r>
+      <w:r>
+        <w:br/>
+      </w:r>
+      <w:r>
+        <w:br/>
+      </w:r>
+      <w:r>
+        <w:rPr>
+          <w:rStyle w:val="ControlFlowTok"/>
+        </w:rPr>
+        <w:t xml:space="preserve">if</w:t>
+      </w:r>
+      <w:r>
+        <w:rPr>
+          <w:rStyle w:val="NormalTok"/>
+        </w:rPr>
+        <w:t xml:space="preserve"> p_value </w:t>
+      </w:r>
+      <w:r>
+        <w:rPr>
+          <w:rStyle w:val="OperatorTok"/>
+        </w:rPr>
+        <w:t xml:space="preserve">&lt;</w:t>
+      </w:r>
+      <w:r>
+        <w:rPr>
+          <w:rStyle w:val="NormalTok"/>
+        </w:rPr>
+        <w:t xml:space="preserve"> </w:t>
+      </w:r>
+      <w:r>
+        <w:rPr>
+          <w:rStyle w:val="FloatTok"/>
+        </w:rPr>
+        <w:t xml:space="preserve">0.05</w:t>
+      </w:r>
+      <w:r>
+        <w:rPr>
+          <w:rStyle w:val="NormalTok"/>
+        </w:rPr>
+        <w:t xml:space="preserve">:</w:t>
+      </w:r>
+      <w:r>
+        <w:br/>
+      </w:r>
+      <w:r>
+        <w:rPr>
+          <w:rStyle w:val="NormalTok"/>
+        </w:rPr>
+        <w:t xml:space="preserve">    conclusion </w:t>
+      </w:r>
+      <w:r>
+        <w:rPr>
+          <w:rStyle w:val="OperatorTok"/>
+        </w:rPr>
+        <w:t xml:space="preserve">+=</w:t>
+      </w:r>
+      <w:r>
+        <w:rPr>
+          <w:rStyle w:val="NormalTok"/>
+        </w:rPr>
+        <w:t xml:space="preserve"> (</w:t>
+      </w:r>
+      <w:r>
+        <w:br/>
+      </w:r>
+      <w:r>
+        <w:rPr>
+          <w:rStyle w:val="NormalTok"/>
+        </w:rPr>
+        <w:t xml:space="preserve">        </w:t>
+      </w:r>
+      <w:r>
+        <w:rPr>
+          <w:rStyle w:val="SpecialStringTok"/>
+        </w:rPr>
+        <w:t xml:space="preserve">f"The test was statistically significant "</w:t>
+      </w:r>
+      <w:r>
+        <w:br/>
+      </w:r>
+      <w:r>
+        <w:rPr>
+          <w:rStyle w:val="NormalTok"/>
+        </w:rPr>
+        <w:t xml:space="preserve">        </w:t>
+      </w:r>
+      <w:r>
+        <w:rPr>
+          <w:rStyle w:val="SpecialStringTok"/>
+        </w:rPr>
+        <w:t xml:space="preserve">f"($</w:t>
+      </w:r>
+      <w:r>
+        <w:rPr>
+          <w:rStyle w:val="CharTok"/>
+        </w:rPr>
+        <w:t xml:space="preserve">\\</w:t>
+      </w:r>
+      <w:r>
+        <w:rPr>
+          <w:rStyle w:val="SpecialStringTok"/>
+        </w:rPr>
+        <w:t xml:space="preserve">chi^2$ = </w:t>
+      </w:r>
+      <w:r>
+        <w:rPr>
+          <w:rStyle w:val="SpecialCharTok"/>
+        </w:rPr>
+        <w:t xml:space="preserve">{</w:t>
+      </w:r>
+      <w:r>
+        <w:rPr>
+          <w:rStyle w:val="NormalTok"/>
+        </w:rPr>
+        <w:t xml:space="preserve">chi2</w:t>
+      </w:r>
+      <w:r>
+        <w:rPr>
+          <w:rStyle w:val="SpecialCharTok"/>
+        </w:rPr>
+        <w:t xml:space="preserve">:.2f}</w:t>
+      </w:r>
+      <w:r>
+        <w:rPr>
+          <w:rStyle w:val="SpecialStringTok"/>
+        </w:rPr>
+        <w:t xml:space="preserve">, df = </w:t>
+      </w:r>
+      <w:r>
+        <w:rPr>
+          <w:rStyle w:val="SpecialCharTok"/>
+        </w:rPr>
+        <w:t xml:space="preserve">{</w:t>
+      </w:r>
+      <w:r>
+        <w:rPr>
+          <w:rStyle w:val="NormalTok"/>
+        </w:rPr>
+        <w:t xml:space="preserve">dof</w:t>
+      </w:r>
+      <w:r>
+        <w:rPr>
+          <w:rStyle w:val="SpecialCharTok"/>
+        </w:rPr>
+        <w:t xml:space="preserve">}</w:t>
+      </w:r>
+      <w:r>
+        <w:rPr>
+          <w:rStyle w:val="SpecialStringTok"/>
+        </w:rPr>
+        <w:t xml:space="preserve">, p = </w:t>
+      </w:r>
+      <w:r>
+        <w:rPr>
+          <w:rStyle w:val="SpecialCharTok"/>
+        </w:rPr>
+        <w:t xml:space="preserve">{</w:t>
+      </w:r>
+      <w:r>
+        <w:rPr>
+          <w:rStyle w:val="NormalTok"/>
+        </w:rPr>
+        <w:t xml:space="preserve">p_value</w:t>
+      </w:r>
+      <w:r>
+        <w:rPr>
+          <w:rStyle w:val="SpecialCharTok"/>
+        </w:rPr>
+        <w:t xml:space="preserve">:.4f}</w:t>
+      </w:r>
+      <w:r>
+        <w:rPr>
+          <w:rStyle w:val="SpecialStringTok"/>
+        </w:rPr>
+        <w:t xml:space="preserve">), "</w:t>
+      </w:r>
+      <w:r>
+        <w:br/>
+      </w:r>
+      <w:r>
+        <w:rPr>
+          <w:rStyle w:val="NormalTok"/>
+        </w:rPr>
+        <w:t xml:space="preserve">        </w:t>
+      </w:r>
+      <w:r>
+        <w:rPr>
+          <w:rStyle w:val="SpecialStringTok"/>
+        </w:rPr>
+        <w:t xml:space="preserve">f"suggesting that tipping quality is not independent of the day "</w:t>
+      </w:r>
+      <w:r>
+        <w:br/>
+      </w:r>
+      <w:r>
+        <w:rPr>
+          <w:rStyle w:val="NormalTok"/>
+        </w:rPr>
+        <w:t xml:space="preserve">        </w:t>
+      </w:r>
+      <w:r>
+        <w:rPr>
+          <w:rStyle w:val="SpecialStringTok"/>
+        </w:rPr>
+        <w:t xml:space="preserve">f"of the week."</w:t>
+      </w:r>
+      <w:r>
+        <w:br/>
+      </w:r>
+      <w:r>
+        <w:rPr>
+          <w:rStyle w:val="NormalTok"/>
+        </w:rPr>
+        <w:t xml:space="preserve">    )</w:t>
+      </w:r>
+      <w:r>
+        <w:br/>
+      </w:r>
+      <w:r>
+        <w:rPr>
+          <w:rStyle w:val="ControlFlowTok"/>
+        </w:rPr>
+        <w:t xml:space="preserve">else</w:t>
+      </w:r>
+      <w:r>
+        <w:rPr>
+          <w:rStyle w:val="NormalTok"/>
+        </w:rPr>
+        <w:t xml:space="preserve">:</w:t>
+      </w:r>
+      <w:r>
+        <w:br/>
+      </w:r>
+      <w:r>
+        <w:rPr>
+          <w:rStyle w:val="NormalTok"/>
+        </w:rPr>
+        <w:t xml:space="preserve">    conclusion </w:t>
+      </w:r>
+      <w:r>
+        <w:rPr>
+          <w:rStyle w:val="OperatorTok"/>
+        </w:rPr>
+        <w:t xml:space="preserve">+=</w:t>
+      </w:r>
+      <w:r>
+        <w:rPr>
+          <w:rStyle w:val="NormalTok"/>
+        </w:rPr>
+        <w:t xml:space="preserve"> (</w:t>
+      </w:r>
+      <w:r>
+        <w:br/>
+      </w:r>
+      <w:r>
+        <w:rPr>
+          <w:rStyle w:val="NormalTok"/>
+        </w:rPr>
+        <w:t xml:space="preserve">        </w:t>
+      </w:r>
+      <w:r>
+        <w:rPr>
+          <w:rStyle w:val="SpecialStringTok"/>
+        </w:rPr>
+        <w:t xml:space="preserve">f"The test was not statistically significant "</w:t>
+      </w:r>
+      <w:r>
+        <w:br/>
+      </w:r>
+      <w:r>
+        <w:rPr>
+          <w:rStyle w:val="NormalTok"/>
+        </w:rPr>
+        <w:t xml:space="preserve">        </w:t>
+      </w:r>
+      <w:r>
+        <w:rPr>
+          <w:rStyle w:val="SpecialStringTok"/>
+        </w:rPr>
+        <w:t xml:space="preserve">f"($</w:t>
+      </w:r>
+      <w:r>
+        <w:rPr>
+          <w:rStyle w:val="CharTok"/>
+        </w:rPr>
+        <w:t xml:space="preserve">\\</w:t>
+      </w:r>
+      <w:r>
+        <w:rPr>
+          <w:rStyle w:val="SpecialStringTok"/>
+        </w:rPr>
+        <w:t xml:space="preserve">chi^2$ = </w:t>
+      </w:r>
+      <w:r>
+        <w:rPr>
+          <w:rStyle w:val="SpecialCharTok"/>
+        </w:rPr>
+        <w:t xml:space="preserve">{</w:t>
+      </w:r>
+      <w:r>
+        <w:rPr>
+          <w:rStyle w:val="NormalTok"/>
+        </w:rPr>
+        <w:t xml:space="preserve">chi2</w:t>
+      </w:r>
+      <w:r>
+        <w:rPr>
+          <w:rStyle w:val="SpecialCharTok"/>
+        </w:rPr>
+        <w:t xml:space="preserve">:.2f}</w:t>
+      </w:r>
+      <w:r>
+        <w:rPr>
+          <w:rStyle w:val="SpecialStringTok"/>
+        </w:rPr>
+        <w:t xml:space="preserve">, df = </w:t>
+      </w:r>
+      <w:r>
+        <w:rPr>
+          <w:rStyle w:val="SpecialCharTok"/>
+        </w:rPr>
+        <w:t xml:space="preserve">{</w:t>
+      </w:r>
+      <w:r>
+        <w:rPr>
+          <w:rStyle w:val="NormalTok"/>
+        </w:rPr>
+        <w:t xml:space="preserve">dof</w:t>
+      </w:r>
+      <w:r>
+        <w:rPr>
+          <w:rStyle w:val="SpecialCharTok"/>
+        </w:rPr>
+        <w:t xml:space="preserve">}</w:t>
+      </w:r>
+      <w:r>
+        <w:rPr>
+          <w:rStyle w:val="SpecialStringTok"/>
+        </w:rPr>
+        <w:t xml:space="preserve">, p = </w:t>
+      </w:r>
+      <w:r>
+        <w:rPr>
+          <w:rStyle w:val="SpecialCharTok"/>
+        </w:rPr>
+        <w:t xml:space="preserve">{</w:t>
+      </w:r>
+      <w:r>
+        <w:rPr>
+          <w:rStyle w:val="NormalTok"/>
+        </w:rPr>
+        <w:t xml:space="preserve">p_value</w:t>
+      </w:r>
+      <w:r>
+        <w:rPr>
+          <w:rStyle w:val="SpecialCharTok"/>
+        </w:rPr>
+        <w:t xml:space="preserve">:.4f}</w:t>
+      </w:r>
+      <w:r>
+        <w:rPr>
+          <w:rStyle w:val="SpecialStringTok"/>
+        </w:rPr>
+        <w:t xml:space="preserve">), "</w:t>
+      </w:r>
+      <w:r>
+        <w:br/>
+      </w:r>
+      <w:r>
+        <w:rPr>
+          <w:rStyle w:val="NormalTok"/>
+        </w:rPr>
+        <w:t xml:space="preserve">        </w:t>
+      </w:r>
+      <w:r>
+        <w:rPr>
+          <w:rStyle w:val="SpecialStringTok"/>
+        </w:rPr>
+        <w:t xml:space="preserve">f"suggesting that tipping quality is independent of the day "</w:t>
+      </w:r>
+      <w:r>
+        <w:br/>
+      </w:r>
+      <w:r>
+        <w:rPr>
+          <w:rStyle w:val="NormalTok"/>
+        </w:rPr>
+        <w:t xml:space="preserve">        </w:t>
+      </w:r>
+      <w:r>
+        <w:rPr>
+          <w:rStyle w:val="SpecialStringTok"/>
+        </w:rPr>
+        <w:t xml:space="preserve">f"of the week—patrons tip at similar rates regardless of the day."</w:t>
+      </w:r>
+      <w:r>
+        <w:br/>
+      </w:r>
+      <w:r>
+        <w:rPr>
+          <w:rStyle w:val="NormalTok"/>
+        </w:rPr>
+        <w:t xml:space="preserve">    )</w:t>
+      </w:r>
+      <w:r>
+        <w:br/>
+      </w:r>
+      <w:r>
+        <w:br/>
+      </w:r>
+      <w:r>
+        <w:rPr>
+          <w:rStyle w:val="NormalTok"/>
+        </w:rPr>
+        <w:t xml:space="preserve">display(Markdown(conclusion))</w:t>
+      </w:r>
+    </w:p>
+    <w:bookmarkStart w:id="84" w:name="repro-chi2"/>
+    <w:p>
+      <w:pPr>
+        <w:pStyle w:val="FirstParagraph"/>
+      </w:pPr>
+      <w:r>
+        <w:t xml:space="preserve">A chi-squared test of independence was conducted to determine whether the proportion of above-median tips differs by day of the week. The test was statistically significant (</w:t>
+      </w:r>
+      <m:oMath>
+        <m:sSup>
+          <m:e>
+            <m:r>
+              <m:t>χ</m:t>
+            </m:r>
+          </m:e>
+          <m:sup>
+            <m:r>
+              <m:t>2</m:t>
+            </m:r>
+          </m:sup>
+        </m:sSup>
+      </m:oMath>
+      <w:r>
+        <w:t xml:space="preserve"> </w:t>
+      </w:r>
+      <w:r>
+        <w:t xml:space="preserve">= 8.55, df = 3, p = 0.0359), suggesting that tipping quality is not independent of the day of the week.</w:t>
+      </w:r>
+    </w:p>
+    <w:bookmarkEnd w:id="84"/>
+    <w:tbl>
+      <w:tblPr>
+        <w:tblStyle w:val="Table"/>
+        <w:tblLook w:firstRow="0" w:lastRow="0" w:firstColumn="0" w:lastColumn="0" w:noHBand="0" w:noVBand="0" w:val="0000"/>
+        <w:tblBorders>
+          <w:left w:val="single" w:sz="24" w:space="0" w:color="CC1914"/>
+          <w:right w:val="single" w:sz="4" w:space="0" w:color="CC1914"/>
+          <w:top w:val="single" w:sz="4" w:space="0" w:color="CC1914"/>
+          <w:bottom w:val="single" w:sz="4" w:space="0" w:color="CC1914"/>
+        </w:tblBorders>
+        <w:tblCellMar>
+          <w:left w:w="144" w:type="dxa"/>
+          <w:right w:w="144" w:type="dxa"/>
+        </w:tblCellMar>
+        <w:tblInd w:w="164" w:type="dxa"/>
+        <w:tblW w:type="pct" w:w="100%"/>
+      </w:tblPr>
+      <w:tr>
+        <w:trPr>
+          <w:cantSplit/>
+        </w:trPr>
+        <w:tc>
+          <w:tcPr>
+            <w:shd w:color="auto" w:fill="f7dddc" w:val="clear"/>
+            <w:tcMar>
+              <w:top w:w="92" w:type="dxa"/>
+              <w:bottom w:w="92" w:type="dxa"/>
+            </w:tcMar>
+          </w:tcPr>
+          <w:p>
+            <w:pPr>
+              <w:pStyle w:val="BodyText"/>
+            </w:pPr>
+            <w:pPr>
+              <w:spacing w:before="0" w:after="0"/>
+              <w:textAlignment w:val="center"/>
+            </w:pPr>
+            <w:r>
+              <w:drawing>
+                <wp:inline>
+                  <wp:extent cx="152400" cy="152400"/>
+                  <wp:effectExtent b="0" l="0" r="0" t="0"/>
+                  <wp:docPr descr="" title="" id="85" name="Picture"/>
+                  <a:graphic>
+                    <a:graphicData uri="http://schemas.openxmlformats.org/drawingml/2006/picture">
+                      <pic:pic>
+                        <pic:nvPicPr>
+                          <pic:cNvPr descr="/Applications/quarto/share/formats/docx/important.png" id="86" name="Picture"/>
+                          <pic:cNvPicPr>
+                            <a:picLocks noChangeArrowheads="1" noChangeAspect="1"/>
+                          </pic:cNvPicPr>
+                        </pic:nvPicPr>
+                        <pic:blipFill>
+                          <a:blip r:embed="rId46"/>
+                          <a:stretch>
+                            <a:fillRect/>
+                          </a:stretch>
+                        </pic:blipFill>
+                        <pic:spPr bwMode="auto">
+                          <a:xfrm>
+                            <a:off x="0" y="0"/>
+                            <a:ext cx="152400" cy="152400"/>
+                          </a:xfrm>
+                          <a:prstGeom prst="rect">
+                            <a:avLst/>
+                          </a:prstGeom>
+                          <a:noFill/>
+                          <a:ln w="9525">
+                            <a:noFill/>
+                            <a:headEnd/>
+                            <a:tailEnd/>
+                          </a:ln>
+                        </pic:spPr>
+                      </pic:pic>
+                    </a:graphicData>
+                  </a:graphic>
+                </wp:inline>
+              </w:drawing>
+            </w:r>
+            <w:r>
+              <w:t xml:space="preserve"> </w:t>
+            </w:r>
+            <w:r>
+              <w:t xml:space="preserve"> </w:t>
+            </w:r>
+            <w:r>
+              <w:t xml:space="preserve">Reproducibility in Action</w:t>
+            </w:r>
+          </w:p>
+        </w:tc>
+      </w:tr>
+      <w:tr>
+        <w:trPr>
+          <w:cantSplit/>
+        </w:trPr>
+        <w:tc>
+          <w:tcPr>
+            <w:tcMar>
+              <w:top w:w="108" w:type="dxa"/>
+              <w:bottom w:w="108" w:type="dxa"/>
+            </w:tcMar>
+          </w:tcPr>
+          <w:p>
+            <w:pPr>
+              <w:pStyle w:val="BodyText"/>
+            </w:pPr>
+            <w:pPr>
+              <w:spacing w:before="16" w:after="16"/>
+            </w:pPr>
+            <w:r>
+              <w:t xml:space="preserve">This code block above handles the significant and non-significant cases. If</w:t>
+            </w:r>
+            <w:r>
+              <w:t xml:space="preserve"> </w:t>
+            </w:r>
+            <w:r>
+              <w:t xml:space="preserve">future data produce a different outcome, the narrative flips automatically.</w:t>
+            </w:r>
+            <w:r>
+              <w:t xml:space="preserve"> </w:t>
+            </w:r>
+            <w:r>
+              <w:t xml:space="preserve">The reader always sees a conclusion that matches the numbers.</w:t>
+            </w:r>
+          </w:p>
+        </w:tc>
+      </w:tr>
+    </w:tbl>
+    <w:bookmarkEnd w:id="87"/>
+    <w:bookmarkEnd w:id="88"/>
+    <w:bookmarkStart w:id="93" w:name="sec-conclusions"/>
+    <w:p>
+      <w:pPr>
+        <w:pStyle w:val="Heading2"/>
+      </w:pPr>
+      <w:r>
+        <w:t xml:space="preserve">5 Conclusions and Recommendations</w:t>
+      </w:r>
+    </w:p>
+    <w:bookmarkStart w:id="89" w:name="sec-summary"/>
+    <w:p>
+      <w:pPr>
+        <w:pStyle w:val="Heading3"/>
+      </w:pPr>
+      <w:r>
+        <w:t xml:space="preserve">5.1 Summary of Findings</w:t>
       </w:r>
     </w:p>
     <w:p>
@@ -7738,14 +9452,14 @@
         <w:t xml:space="preserve">).</w:t>
       </w:r>
     </w:p>
-    <w:bookmarkEnd w:id="79"/>
-    <w:bookmarkStart w:id="82" w:name="sec-implications"/>
+    <w:bookmarkEnd w:id="89"/>
+    <w:bookmarkStart w:id="92" w:name="sec-implications"/>
     <w:p>
       <w:pPr>
         <w:pStyle w:val="Heading3"/>
       </w:pPr>
       <w:r>
-        <w:t xml:space="preserve">4.2 Practical Implications</w:t>
+        <w:t xml:space="preserve">5.2 Practical Implications</w:t>
       </w:r>
     </w:p>
     <w:p>
@@ -7837,13 +9551,13 @@
         <w:t xml:space="preserve">patrons.</w:t>
       </w:r>
     </w:p>
-    <w:bookmarkStart w:id="80" w:name="sec-limitations"/>
+    <w:bookmarkStart w:id="90" w:name="sec-limitations"/>
     <w:p>
       <w:pPr>
         <w:pStyle w:val="Heading4"/>
       </w:pPr>
       <w:r>
-        <w:t xml:space="preserve">4.2.1 Limitations</w:t>
+        <w:t xml:space="preserve">5.2.1 Limitations</w:t>
       </w:r>
     </w:p>
     <w:p>
@@ -7890,14 +9604,14 @@
         <w:t xml:space="preserve">Temporal effects (e.g., holidays, seasons) are not captured.</w:t>
       </w:r>
     </w:p>
-    <w:bookmarkEnd w:id="80"/>
-    <w:bookmarkStart w:id="81" w:name="sec-future"/>
+    <w:bookmarkEnd w:id="90"/>
+    <w:bookmarkStart w:id="91" w:name="sec-future"/>
     <w:p>
       <w:pPr>
         <w:pStyle w:val="Heading4"/>
       </w:pPr>
       <w:r>
-        <w:t xml:space="preserve">4.2.2 Future Directions</w:t>
+        <w:t xml:space="preserve">5.2.2 Future Directions</w:t>
       </w:r>
     </w:p>
     <w:p>
@@ -7923,10 +9637,10 @@
         <w:t xml:space="preserve">, and examining temporal trends over longer periods.</w:t>
       </w:r>
     </w:p>
-    <w:bookmarkEnd w:id="81"/>
-    <w:bookmarkEnd w:id="82"/>
-    <w:bookmarkEnd w:id="83"/>
-    <w:bookmarkStart w:id="92" w:name="references"/>
+    <w:bookmarkEnd w:id="91"/>
+    <w:bookmarkEnd w:id="92"/>
+    <w:bookmarkEnd w:id="93"/>
+    <w:bookmarkStart w:id="102" w:name="references"/>
     <w:p>
       <w:pPr>
         <w:pStyle w:val="Heading2"/>
@@ -7935,8 +9649,8 @@
         <w:t xml:space="preserve">References</w:t>
       </w:r>
     </w:p>
-    <w:bookmarkStart w:id="91" w:name="refs"/>
-    <w:bookmarkStart w:id="84" w:name="ref-james2021introduction"/>
+    <w:bookmarkStart w:id="101" w:name="refs"/>
+    <w:bookmarkStart w:id="94" w:name="ref-james2021introduction"/>
     <w:p>
       <w:pPr>
         <w:pStyle w:val="Bibliography"/>
@@ -7975,8 +9689,8 @@
         <w:t xml:space="preserve">(2nd ed.). Springer.</w:t>
       </w:r>
     </w:p>
-    <w:bookmarkEnd w:id="84"/>
-    <w:bookmarkStart w:id="85" w:name="ref-mckinney2011pandas"/>
+    <w:bookmarkEnd w:id="94"/>
+    <w:bookmarkStart w:id="95" w:name="ref-mckinney2011pandas"/>
     <w:p>
       <w:pPr>
         <w:pStyle w:val="Bibliography"/>
@@ -8023,8 +9737,8 @@
         <w:t xml:space="preserve">(9), 1–12.</w:t>
       </w:r>
     </w:p>
-    <w:bookmarkEnd w:id="85"/>
-    <w:bookmarkStart w:id="86" w:name="ref-tufte2001visual"/>
+    <w:bookmarkEnd w:id="95"/>
+    <w:bookmarkStart w:id="96" w:name="ref-tufte2001visual"/>
     <w:p>
       <w:pPr>
         <w:pStyle w:val="Bibliography"/>
@@ -8049,8 +9763,8 @@
         <w:t xml:space="preserve">(2nd ed.). Graphics Press.</w:t>
       </w:r>
     </w:p>
-    <w:bookmarkEnd w:id="86"/>
-    <w:bookmarkStart w:id="88" w:name="ref-waskom2021seaborn"/>
+    <w:bookmarkEnd w:id="96"/>
+    <w:bookmarkStart w:id="98" w:name="ref-waskom2021seaborn"/>
     <w:p>
       <w:pPr>
         <w:pStyle w:val="Bibliography"/>
@@ -8087,7 +9801,7 @@
       <w:r>
         <w:t xml:space="preserve"> </w:t>
       </w:r>
-      <w:hyperlink r:id="rId87">
+      <w:hyperlink r:id="rId97">
         <w:r>
           <w:rPr>
             <w:rStyle w:val="Hyperlink"/>
@@ -8096,8 +9810,8 @@
         </w:r>
       </w:hyperlink>
     </w:p>
-    <w:bookmarkEnd w:id="88"/>
-    <w:bookmarkStart w:id="90" w:name="ref-wickham2014tidy"/>
+    <w:bookmarkEnd w:id="98"/>
+    <w:bookmarkStart w:id="100" w:name="ref-wickham2014tidy"/>
     <w:p>
       <w:pPr>
         <w:pStyle w:val="Bibliography"/>
@@ -8134,7 +9848,7 @@
       <w:r>
         <w:t xml:space="preserve"> </w:t>
       </w:r>
-      <w:hyperlink r:id="rId89">
+      <w:hyperlink r:id="rId99">
         <w:r>
           <w:rPr>
             <w:rStyle w:val="Hyperlink"/>
@@ -8143,21 +9857,13 @@
         </w:r>
       </w:hyperlink>
     </w:p>
-    <w:bookmarkEnd w:id="90"/>
-    <w:bookmarkEnd w:id="91"/>
-    <w:bookmarkEnd w:id="92"/>
+    <w:bookmarkEnd w:id="100"/>
+    <w:bookmarkEnd w:id="101"/>
+    <w:bookmarkEnd w:id="102"/>
     <w:sectPr>
-      <w:headerReference r:id="rId10" w:type="even"/>
-      <w:headerReference r:id="rId9" w:type="default"/>
-      <w:footerReference r:id="rId12" w:type="even"/>
-      <w:footerReference r:id="rId14" w:type="default"/>
-      <w:headerReference r:id="rId11" w:type="first"/>
-      <w:footerReference r:id="rId13" w:type="first"/>
       <w:pgSz w:h="15840" w:w="12240"/>
       <w:pgMar w:bottom="1440" w:footer="720" w:gutter="0" w:header="720" w:left="1440" w:right="1440" w:top="1440"/>
-      <w:pgNumType w:start="1"/>
       <w:cols w:space="720"/>
-      <w:docGrid w:linePitch="299"/>
     </w:sectPr>
   </w:body>
 </w:document>
@@ -8167,36 +9873,6 @@
 <w:comments xmlns:w="http://schemas.openxmlformats.org/wordprocessingml/2006/main" xmlns:m="http://schemas.openxmlformats.org/officeDocument/2006/math" xmlns:r="http://schemas.openxmlformats.org/officeDocument/2006/relationships" xmlns:o="urn:schemas-microsoft-com:office:office" xmlns:v="urn:schemas-microsoft-com:vml" xmlns:w10="urn:schemas-microsoft-com:office:word" xmlns:a="http://schemas.openxmlformats.org/drawingml/2006/main" xmlns:pic="http://schemas.openxmlformats.org/drawingml/2006/picture" xmlns:wp="http://schemas.openxmlformats.org/drawingml/2006/wordprocessingDrawing"/>
 </file>
 
-<file path=word/footer1.xml><?xml version="1.0" encoding="utf-8"?>
-<w:ftr xmlns:wpc="http://schemas.microsoft.com/office/word/2010/wordprocessingCanvas" xmlns:cx="http://schemas.microsoft.com/office/drawing/2014/chartex" xmlns:cx1="http://schemas.microsoft.com/office/drawing/2015/9/8/chartex" xmlns:cx2="http://schemas.microsoft.com/office/drawing/2015/10/21/chartex" xmlns:cx3="http://schemas.microsoft.com/office/drawing/2016/5/9/chartex" xmlns:cx4="http://schemas.microsoft.com/office/drawing/2016/5/10/chartex" xmlns:cx5="http://schemas.microsoft.com/office/drawing/2016/5/11/chartex" xmlns:cx6="http://schemas.microsoft.com/office/drawing/2016/5/12/chartex" xmlns:cx7="http://schemas.microsoft.com/office/drawing/2016/5/13/chartex" xmlns:cx8="http://schemas.microsoft.com/office/drawing/2016/5/14/chartex" xmlns:mc="http://schemas.openxmlformats.org/markup-compatibility/2006" xmlns:aink="http://schemas.microsoft.com/office/drawing/2016/ink" xmlns:am3d="http://schemas.microsoft.com/office/drawing/2017/model3d" xmlns:o="urn:schemas-microsoft-com:office:office" xmlns:oel="http://schemas.microsoft.com/office/2019/extlst" xmlns:r="http://schemas.openxmlformats.org/officeDocument/2006/relationships" xmlns:m="http://schemas.openxmlformats.org/officeDocument/2006/math" xmlns:v="urn:schemas-microsoft-com:vml" xmlns:wp14="http://schemas.microsoft.com/office/word/2010/wordprocessingDrawing" xmlns:wp="http://schemas.openxmlformats.org/drawingml/2006/wordprocessingDrawing" xmlns:w10="urn:schemas-microsoft-com:office:word" xmlns:w="http://schemas.openxmlformats.org/wordprocessingml/2006/main" xmlns:w14="http://schemas.microsoft.com/office/word/2010/wordml" xmlns:w15="http://schemas.microsoft.com/office/word/2012/wordml" xmlns:w16cex="http://schemas.microsoft.com/office/word/2018/wordml/cex" xmlns:w16cid="http://schemas.microsoft.com/office/word/2016/wordml/cid" xmlns:w16="http://schemas.microsoft.com/office/word/2018/wordml" xmlns:w16du="http://schemas.microsoft.com/office/word/2023/wordml/word16du" xmlns:w16sdtdh="http://schemas.microsoft.com/office/word/2020/wordml/sdtdatahash" xmlns:w16sdtfl="http://schemas.microsoft.com/office/word/2024/wordml/sdtformatlock" xmlns:w16se="http://schemas.microsoft.com/office/word/2015/wordml/symex" xmlns:wpg="http://schemas.microsoft.com/office/word/2010/wordprocessingGroup" xmlns:wpi="http://schemas.microsoft.com/office/word/2010/wordprocessingInk" xmlns:wne="http://schemas.microsoft.com/office/word/2006/wordml" xmlns:wps="http://schemas.microsoft.com/office/word/2010/wordprocessingShape" mc:Ignorable="w14 w15 w16se w16cid w16 w16cex w16sdtdh w16sdtfl w16du wp14">
-  <w:p>
-    <w:pPr>
-      <w:pStyle w:val="Footer"/>
-    </w:pPr>
-  </w:p>
-</w:ftr>
-</file>
-
-<file path=word/footer2.xml><?xml version="1.0" encoding="utf-8"?>
-<w:ftr xmlns:wpc="http://schemas.microsoft.com/office/word/2010/wordprocessingCanvas" xmlns:cx="http://schemas.microsoft.com/office/drawing/2014/chartex" xmlns:cx1="http://schemas.microsoft.com/office/drawing/2015/9/8/chartex" xmlns:cx2="http://schemas.microsoft.com/office/drawing/2015/10/21/chartex" xmlns:cx3="http://schemas.microsoft.com/office/drawing/2016/5/9/chartex" xmlns:cx4="http://schemas.microsoft.com/office/drawing/2016/5/10/chartex" xmlns:cx5="http://schemas.microsoft.com/office/drawing/2016/5/11/chartex" xmlns:cx6="http://schemas.microsoft.com/office/drawing/2016/5/12/chartex" xmlns:cx7="http://schemas.microsoft.com/office/drawing/2016/5/13/chartex" xmlns:cx8="http://schemas.microsoft.com/office/drawing/2016/5/14/chartex" xmlns:mc="http://schemas.openxmlformats.org/markup-compatibility/2006" xmlns:aink="http://schemas.microsoft.com/office/drawing/2016/ink" xmlns:am3d="http://schemas.microsoft.com/office/drawing/2017/model3d" xmlns:o="urn:schemas-microsoft-com:office:office" xmlns:oel="http://schemas.microsoft.com/office/2019/extlst" xmlns:r="http://schemas.openxmlformats.org/officeDocument/2006/relationships" xmlns:m="http://schemas.openxmlformats.org/officeDocument/2006/math" xmlns:v="urn:schemas-microsoft-com:vml" xmlns:wp14="http://schemas.microsoft.com/office/word/2010/wordprocessingDrawing" xmlns:wp="http://schemas.openxmlformats.org/drawingml/2006/wordprocessingDrawing" xmlns:w10="urn:schemas-microsoft-com:office:word" xmlns:w="http://schemas.openxmlformats.org/wordprocessingml/2006/main" xmlns:w14="http://schemas.microsoft.com/office/word/2010/wordml" xmlns:w15="http://schemas.microsoft.com/office/word/2012/wordml" xmlns:w16cex="http://schemas.microsoft.com/office/word/2018/wordml/cex" xmlns:w16cid="http://schemas.microsoft.com/office/word/2016/wordml/cid" xmlns:w16="http://schemas.microsoft.com/office/word/2018/wordml" xmlns:w16du="http://schemas.microsoft.com/office/word/2023/wordml/word16du" xmlns:w16sdtdh="http://schemas.microsoft.com/office/word/2020/wordml/sdtdatahash" xmlns:w16sdtfl="http://schemas.microsoft.com/office/word/2024/wordml/sdtformatlock" xmlns:w16se="http://schemas.microsoft.com/office/word/2015/wordml/symex" xmlns:wpg="http://schemas.microsoft.com/office/word/2010/wordprocessingGroup" xmlns:wpi="http://schemas.microsoft.com/office/word/2010/wordprocessingInk" xmlns:wne="http://schemas.microsoft.com/office/word/2006/wordml" xmlns:wps="http://schemas.microsoft.com/office/word/2010/wordprocessingShape" mc:Ignorable="w14 w15 w16se w16cid w16 w16cex w16sdtdh w16sdtfl w16du wp14">
-  <w:p>
-    <w:pPr>
-      <w:pStyle w:val="Footer"/>
-    </w:pPr>
-  </w:p>
-</w:ftr>
-</file>
-
-<file path=word/footer3.xml><?xml version="1.0" encoding="utf-8"?>
-<w:ftr xmlns:wpc="http://schemas.microsoft.com/office/word/2010/wordprocessingCanvas" xmlns:cx="http://schemas.microsoft.com/office/drawing/2014/chartex" xmlns:cx1="http://schemas.microsoft.com/office/drawing/2015/9/8/chartex" xmlns:cx2="http://schemas.microsoft.com/office/drawing/2015/10/21/chartex" xmlns:cx3="http://schemas.microsoft.com/office/drawing/2016/5/9/chartex" xmlns:cx4="http://schemas.microsoft.com/office/drawing/2016/5/10/chartex" xmlns:cx5="http://schemas.microsoft.com/office/drawing/2016/5/11/chartex" xmlns:cx6="http://schemas.microsoft.com/office/drawing/2016/5/12/chartex" xmlns:cx7="http://schemas.microsoft.com/office/drawing/2016/5/13/chartex" xmlns:cx8="http://schemas.microsoft.com/office/drawing/2016/5/14/chartex" xmlns:mc="http://schemas.openxmlformats.org/markup-compatibility/2006" xmlns:aink="http://schemas.microsoft.com/office/drawing/2016/ink" xmlns:am3d="http://schemas.microsoft.com/office/drawing/2017/model3d" xmlns:o="urn:schemas-microsoft-com:office:office" xmlns:oel="http://schemas.microsoft.com/office/2019/extlst" xmlns:r="http://schemas.openxmlformats.org/officeDocument/2006/relationships" xmlns:m="http://schemas.openxmlformats.org/officeDocument/2006/math" xmlns:v="urn:schemas-microsoft-com:vml" xmlns:wp14="http://schemas.microsoft.com/office/word/2010/wordprocessingDrawing" xmlns:wp="http://schemas.openxmlformats.org/drawingml/2006/wordprocessingDrawing" xmlns:w10="urn:schemas-microsoft-com:office:word" xmlns:w="http://schemas.openxmlformats.org/wordprocessingml/2006/main" xmlns:w14="http://schemas.microsoft.com/office/word/2010/wordml" xmlns:w15="http://schemas.microsoft.com/office/word/2012/wordml" xmlns:w16cex="http://schemas.microsoft.com/office/word/2018/wordml/cex" xmlns:w16cid="http://schemas.microsoft.com/office/word/2016/wordml/cid" xmlns:w16="http://schemas.microsoft.com/office/word/2018/wordml" xmlns:w16du="http://schemas.microsoft.com/office/word/2023/wordml/word16du" xmlns:w16sdtdh="http://schemas.microsoft.com/office/word/2020/wordml/sdtdatahash" xmlns:w16sdtfl="http://schemas.microsoft.com/office/word/2024/wordml/sdtformatlock" xmlns:w16se="http://schemas.microsoft.com/office/word/2015/wordml/symex" xmlns:wpg="http://schemas.microsoft.com/office/word/2010/wordprocessingGroup" xmlns:wpi="http://schemas.microsoft.com/office/word/2010/wordprocessingInk" xmlns:wne="http://schemas.microsoft.com/office/word/2006/wordml" xmlns:wps="http://schemas.microsoft.com/office/word/2010/wordprocessingShape" mc:Ignorable="w14 w15 w16se w16cid w16 w16cex w16sdtdh w16sdtfl w16du wp14">
-  <w:p>
-    <w:pPr>
-      <w:pStyle w:val="Footer"/>
-    </w:pPr>
-  </w:p>
-</w:ftr>
-</file>
-
 <file path=word/footnotes.xml><?xml version="1.0" encoding="utf-8"?>
 <w:footnotes xmlns:w="http://schemas.openxmlformats.org/wordprocessingml/2006/main" xmlns:m="http://schemas.openxmlformats.org/officeDocument/2006/math" xmlns:r="http://schemas.openxmlformats.org/officeDocument/2006/relationships" xmlns:o="urn:schemas-microsoft-com:office:office" xmlns:v="urn:schemas-microsoft-com:vml" xmlns:w10="urn:schemas-microsoft-com:office:word" xmlns:a="http://schemas.openxmlformats.org/drawingml/2006/main" xmlns:pic="http://schemas.openxmlformats.org/drawingml/2006/picture" xmlns:wp="http://schemas.openxmlformats.org/drawingml/2006/wordprocessingDrawing">
   <w:footnote w:type="continuationSeparator" w:id="0">
@@ -8216,38 +9892,112 @@
 </w:footnotes>
 </file>
 
-<file path=word/header1.xml><?xml version="1.0" encoding="utf-8"?>
-<w:hdr xmlns:wpc="http://schemas.microsoft.com/office/word/2010/wordprocessingCanvas" xmlns:cx="http://schemas.microsoft.com/office/drawing/2014/chartex" xmlns:cx1="http://schemas.microsoft.com/office/drawing/2015/9/8/chartex" xmlns:cx2="http://schemas.microsoft.com/office/drawing/2015/10/21/chartex" xmlns:cx3="http://schemas.microsoft.com/office/drawing/2016/5/9/chartex" xmlns:cx4="http://schemas.microsoft.com/office/drawing/2016/5/10/chartex" xmlns:cx5="http://schemas.microsoft.com/office/drawing/2016/5/11/chartex" xmlns:cx6="http://schemas.microsoft.com/office/drawing/2016/5/12/chartex" xmlns:cx7="http://schemas.microsoft.com/office/drawing/2016/5/13/chartex" xmlns:cx8="http://schemas.microsoft.com/office/drawing/2016/5/14/chartex" xmlns:mc="http://schemas.openxmlformats.org/markup-compatibility/2006" xmlns:aink="http://schemas.microsoft.com/office/drawing/2016/ink" xmlns:am3d="http://schemas.microsoft.com/office/drawing/2017/model3d" xmlns:o="urn:schemas-microsoft-com:office:office" xmlns:oel="http://schemas.microsoft.com/office/2019/extlst" xmlns:r="http://schemas.openxmlformats.org/officeDocument/2006/relationships" xmlns:m="http://schemas.openxmlformats.org/officeDocument/2006/math" xmlns:v="urn:schemas-microsoft-com:vml" xmlns:wp14="http://schemas.microsoft.com/office/word/2010/wordprocessingDrawing" xmlns:wp="http://schemas.openxmlformats.org/drawingml/2006/wordprocessingDrawing" xmlns:w10="urn:schemas-microsoft-com:office:word" xmlns:w="http://schemas.openxmlformats.org/wordprocessingml/2006/main" xmlns:w14="http://schemas.microsoft.com/office/word/2010/wordml" xmlns:w15="http://schemas.microsoft.com/office/word/2012/wordml" xmlns:w16cex="http://schemas.microsoft.com/office/word/2018/wordml/cex" xmlns:w16cid="http://schemas.microsoft.com/office/word/2016/wordml/cid" xmlns:w16="http://schemas.microsoft.com/office/word/2018/wordml" xmlns:w16du="http://schemas.microsoft.com/office/word/2023/wordml/word16du" xmlns:w16sdtdh="http://schemas.microsoft.com/office/word/2020/wordml/sdtdatahash" xmlns:w16sdtfl="http://schemas.microsoft.com/office/word/2024/wordml/sdtformatlock" xmlns:w16se="http://schemas.microsoft.com/office/word/2015/wordml/symex" xmlns:wpg="http://schemas.microsoft.com/office/word/2010/wordprocessingGroup" xmlns:wpi="http://schemas.microsoft.com/office/word/2010/wordprocessingInk" xmlns:wne="http://schemas.microsoft.com/office/word/2006/wordml" xmlns:wps="http://schemas.microsoft.com/office/word/2010/wordprocessingShape" mc:Ignorable="w14 w15 w16se w16cid w16 w16cex w16sdtdh w16sdtfl w16du wp14">
-  <w:p>
-    <w:pPr>
-      <w:pStyle w:val="Header"/>
-    </w:pPr>
-  </w:p>
-</w:hdr>
-</file>
-
-<file path=word/header2.xml><?xml version="1.0" encoding="utf-8"?>
-<w:hdr xmlns:wpc="http://schemas.microsoft.com/office/word/2010/wordprocessingCanvas" xmlns:cx="http://schemas.microsoft.com/office/drawing/2014/chartex" xmlns:cx1="http://schemas.microsoft.com/office/drawing/2015/9/8/chartex" xmlns:cx2="http://schemas.microsoft.com/office/drawing/2015/10/21/chartex" xmlns:cx3="http://schemas.microsoft.com/office/drawing/2016/5/9/chartex" xmlns:cx4="http://schemas.microsoft.com/office/drawing/2016/5/10/chartex" xmlns:cx5="http://schemas.microsoft.com/office/drawing/2016/5/11/chartex" xmlns:cx6="http://schemas.microsoft.com/office/drawing/2016/5/12/chartex" xmlns:cx7="http://schemas.microsoft.com/office/drawing/2016/5/13/chartex" xmlns:cx8="http://schemas.microsoft.com/office/drawing/2016/5/14/chartex" xmlns:mc="http://schemas.openxmlformats.org/markup-compatibility/2006" xmlns:aink="http://schemas.microsoft.com/office/drawing/2016/ink" xmlns:am3d="http://schemas.microsoft.com/office/drawing/2017/model3d" xmlns:o="urn:schemas-microsoft-com:office:office" xmlns:oel="http://schemas.microsoft.com/office/2019/extlst" xmlns:r="http://schemas.openxmlformats.org/officeDocument/2006/relationships" xmlns:m="http://schemas.openxmlformats.org/officeDocument/2006/math" xmlns:v="urn:schemas-microsoft-com:vml" xmlns:wp14="http://schemas.microsoft.com/office/word/2010/wordprocessingDrawing" xmlns:wp="http://schemas.openxmlformats.org/drawingml/2006/wordprocessingDrawing" xmlns:w10="urn:schemas-microsoft-com:office:word" xmlns:w="http://schemas.openxmlformats.org/wordprocessingml/2006/main" xmlns:w14="http://schemas.microsoft.com/office/word/2010/wordml" xmlns:w15="http://schemas.microsoft.com/office/word/2012/wordml" xmlns:w16cex="http://schemas.microsoft.com/office/word/2018/wordml/cex" xmlns:w16cid="http://schemas.microsoft.com/office/word/2016/wordml/cid" xmlns:w16="http://schemas.microsoft.com/office/word/2018/wordml" xmlns:w16du="http://schemas.microsoft.com/office/word/2023/wordml/word16du" xmlns:w16sdtdh="http://schemas.microsoft.com/office/word/2020/wordml/sdtdatahash" xmlns:w16sdtfl="http://schemas.microsoft.com/office/word/2024/wordml/sdtformatlock" xmlns:w16se="http://schemas.microsoft.com/office/word/2015/wordml/symex" xmlns:wpg="http://schemas.microsoft.com/office/word/2010/wordprocessingGroup" xmlns:wpi="http://schemas.microsoft.com/office/word/2010/wordprocessingInk" xmlns:wne="http://schemas.microsoft.com/office/word/2006/wordml" xmlns:wps="http://schemas.microsoft.com/office/word/2010/wordprocessingShape" mc:Ignorable="w14 w15 w16se w16cid w16 w16cex w16sdtdh w16sdtfl w16du wp14">
-  <w:p>
-    <w:pPr>
-      <w:pStyle w:val="Header"/>
-    </w:pPr>
-  </w:p>
-</w:hdr>
-</file>
-
-<file path=word/header3.xml><?xml version="1.0" encoding="utf-8"?>
-<w:hdr xmlns:wpc="http://schemas.microsoft.com/office/word/2010/wordprocessingCanvas" xmlns:cx="http://schemas.microsoft.com/office/drawing/2014/chartex" xmlns:cx1="http://schemas.microsoft.com/office/drawing/2015/9/8/chartex" xmlns:cx2="http://schemas.microsoft.com/office/drawing/2015/10/21/chartex" xmlns:cx3="http://schemas.microsoft.com/office/drawing/2016/5/9/chartex" xmlns:cx4="http://schemas.microsoft.com/office/drawing/2016/5/10/chartex" xmlns:cx5="http://schemas.microsoft.com/office/drawing/2016/5/11/chartex" xmlns:cx6="http://schemas.microsoft.com/office/drawing/2016/5/12/chartex" xmlns:cx7="http://schemas.microsoft.com/office/drawing/2016/5/13/chartex" xmlns:cx8="http://schemas.microsoft.com/office/drawing/2016/5/14/chartex" xmlns:mc="http://schemas.openxmlformats.org/markup-compatibility/2006" xmlns:aink="http://schemas.microsoft.com/office/drawing/2016/ink" xmlns:am3d="http://schemas.microsoft.com/office/drawing/2017/model3d" xmlns:o="urn:schemas-microsoft-com:office:office" xmlns:oel="http://schemas.microsoft.com/office/2019/extlst" xmlns:r="http://schemas.openxmlformats.org/officeDocument/2006/relationships" xmlns:m="http://schemas.openxmlformats.org/officeDocument/2006/math" xmlns:v="urn:schemas-microsoft-com:vml" xmlns:wp14="http://schemas.microsoft.com/office/word/2010/wordprocessingDrawing" xmlns:wp="http://schemas.openxmlformats.org/drawingml/2006/wordprocessingDrawing" xmlns:w10="urn:schemas-microsoft-com:office:word" xmlns:w="http://schemas.openxmlformats.org/wordprocessingml/2006/main" xmlns:w14="http://schemas.microsoft.com/office/word/2010/wordml" xmlns:w15="http://schemas.microsoft.com/office/word/2012/wordml" xmlns:w16cex="http://schemas.microsoft.com/office/word/2018/wordml/cex" xmlns:w16cid="http://schemas.microsoft.com/office/word/2016/wordml/cid" xmlns:w16="http://schemas.microsoft.com/office/word/2018/wordml" xmlns:w16du="http://schemas.microsoft.com/office/word/2023/wordml/word16du" xmlns:w16sdtdh="http://schemas.microsoft.com/office/word/2020/wordml/sdtdatahash" xmlns:w16sdtfl="http://schemas.microsoft.com/office/word/2024/wordml/sdtformatlock" xmlns:w16se="http://schemas.microsoft.com/office/word/2015/wordml/symex" xmlns:wpg="http://schemas.microsoft.com/office/word/2010/wordprocessingGroup" xmlns:wpi="http://schemas.microsoft.com/office/word/2010/wordprocessingInk" xmlns:wne="http://schemas.microsoft.com/office/word/2006/wordml" xmlns:wps="http://schemas.microsoft.com/office/word/2010/wordprocessingShape" mc:Ignorable="w14 w15 w16se w16cid w16 w16cex w16sdtdh w16sdtfl w16du wp14">
-  <w:p>
-    <w:pPr>
-      <w:pStyle w:val="Header"/>
-    </w:pPr>
-  </w:p>
-</w:hdr>
-</file>
-
 <file path=word/numbering.xml><?xml version="1.0" encoding="utf-8"?>
-<w:numbering xmlns:w="http://schemas.openxmlformats.org/wordprocessingml/2006/main">
+<w:numbering xmlns:aink="http://schemas.microsoft.com/office/drawing/2016/ink" xmlns:am3d="http://schemas.microsoft.com/office/drawing/2017/model3d" xmlns:cx="http://schemas.microsoft.com/office/drawing/2014/chartex" xmlns:cx1="http://schemas.microsoft.com/office/drawing/2015/9/8/chartex" xmlns:cx2="http://schemas.microsoft.com/office/drawing/2015/10/21/chartex" xmlns:cx3="http://schemas.microsoft.com/office/drawing/2016/5/9/chartex" xmlns:cx4="http://schemas.microsoft.com/office/drawing/2016/5/10/chartex" xmlns:cx5="http://schemas.microsoft.com/office/drawing/2016/5/11/chartex" xmlns:cx6="http://schemas.microsoft.com/office/drawing/2016/5/12/chartex" xmlns:cx7="http://schemas.microsoft.com/office/drawing/2016/5/13/chartex" xmlns:cx8="http://schemas.microsoft.com/office/drawing/2016/5/14/chartex" xmlns:m="http://schemas.openxmlformats.org/officeDocument/2006/math" xmlns:mc="http://schemas.openxmlformats.org/markup-compatibility/2006" xmlns:o="urn:schemas-microsoft-com:office:office" xmlns:oel="http://schemas.microsoft.com/office/2019/extlst" xmlns:r="http://schemas.openxmlformats.org/officeDocument/2006/relationships" xmlns:v="urn:schemas-microsoft-com:vml" xmlns:w="http://schemas.openxmlformats.org/wordprocessingml/2006/main" xmlns:w10="urn:schemas-microsoft-com:office:word" xmlns:w14="http://schemas.microsoft.com/office/word/2010/wordml" xmlns:w15="http://schemas.microsoft.com/office/word/2012/wordml" xmlns:w16="http://schemas.microsoft.com/office/word/2018/wordml" xmlns:w16cex="http://schemas.microsoft.com/office/word/2018/wordml/cex" xmlns:w16cid="http://schemas.microsoft.com/office/word/2016/wordml/cid" xmlns:w16du="http://schemas.microsoft.com/office/word/2023/wordml/word16du" xmlns:w16sdtdh="http://schemas.microsoft.com/office/word/2020/wordml/sdtdatahash" xmlns:w16sdtfl="http://schemas.microsoft.com/office/word/2024/wordml/sdtformatlock" xmlns:w16se="http://schemas.microsoft.com/office/word/2015/wordml/symex" xmlns:wne="http://schemas.microsoft.com/office/word/2006/wordml" xmlns:wp="http://schemas.openxmlformats.org/drawingml/2006/wordprocessingDrawing" xmlns:wp14="http://schemas.microsoft.com/office/word/2010/wordprocessingDrawing" xmlns:wpc="http://schemas.microsoft.com/office/word/2010/wordprocessingCanvas" xmlns:wpg="http://schemas.microsoft.com/office/word/2010/wordprocessingGroup" xmlns:wpi="http://schemas.microsoft.com/office/word/2010/wordprocessingInk" xmlns:wps="http://schemas.microsoft.com/office/word/2010/wordprocessingShape" mc:Ignorable="w14 w15 w16se w16cid w16 w16cex w16sdtdh w16sdtfl w16du wp14">
+  <w:abstractNum w15:restartNumberingAfterBreak="0" w:abstractNumId="0">
+    <w:nsid w:val="170CD2DE"/>
+    <w:multiLevelType w:val="multilevel"/>
+    <w:tmpl w:val="17E40444"/>
+    <w:lvl w:ilvl="0">
+      <w:numFmt w:val="bullet"/>
+      <w:lvlText w:val=" "/>
+      <w:lvlJc w:val="left"/>
+      <w:pPr>
+        <w:tabs>
+          <w:tab w:pos="0" w:val="num"/>
+        </w:tabs>
+        <w:ind w:hanging="480" w:left="480"/>
+      </w:pPr>
+    </w:lvl>
+    <w:lvl w:ilvl="1">
+      <w:numFmt w:val="bullet"/>
+      <w:lvlText w:val=" "/>
+      <w:lvlJc w:val="left"/>
+      <w:pPr>
+        <w:tabs>
+          <w:tab w:pos="720" w:val="num"/>
+        </w:tabs>
+        <w:ind w:hanging="480" w:left="1200"/>
+      </w:pPr>
+    </w:lvl>
+    <w:lvl w:ilvl="2">
+      <w:numFmt w:val="bullet"/>
+      <w:lvlText w:val=" "/>
+      <w:lvlJc w:val="left"/>
+      <w:pPr>
+        <w:tabs>
+          <w:tab w:pos="1440" w:val="num"/>
+        </w:tabs>
+        <w:ind w:hanging="480" w:left="1920"/>
+      </w:pPr>
+    </w:lvl>
+    <w:lvl w:ilvl="3">
+      <w:numFmt w:val="bullet"/>
+      <w:lvlText w:val=" "/>
+      <w:lvlJc w:val="left"/>
+      <w:pPr>
+        <w:tabs>
+          <w:tab w:pos="2160" w:val="num"/>
+        </w:tabs>
+        <w:ind w:hanging="480" w:left="2640"/>
+      </w:pPr>
+    </w:lvl>
+    <w:lvl w:ilvl="4">
+      <w:numFmt w:val="bullet"/>
+      <w:lvlText w:val=" "/>
+      <w:lvlJc w:val="left"/>
+      <w:pPr>
+        <w:tabs>
+          <w:tab w:pos="2880" w:val="num"/>
+        </w:tabs>
+        <w:ind w:hanging="480" w:left="3360"/>
+      </w:pPr>
+    </w:lvl>
+    <w:lvl w:ilvl="5">
+      <w:numFmt w:val="bullet"/>
+      <w:lvlText w:val=" "/>
+      <w:lvlJc w:val="left"/>
+      <w:pPr>
+        <w:tabs>
+          <w:tab w:pos="3600" w:val="num"/>
+        </w:tabs>
+        <w:ind w:hanging="480" w:left="4080"/>
+      </w:pPr>
+    </w:lvl>
+    <w:lvl w:ilvl="6">
+      <w:numFmt w:val="bullet"/>
+      <w:lvlText w:val=" "/>
+      <w:lvlJc w:val="left"/>
+      <w:pPr>
+        <w:tabs>
+          <w:tab w:pos="4320" w:val="num"/>
+        </w:tabs>
+        <w:ind w:hanging="480" w:left="4800"/>
+      </w:pPr>
+    </w:lvl>
+    <w:lvl w:ilvl="7">
+      <w:numFmt w:val="bullet"/>
+      <w:lvlText w:val=" "/>
+      <w:lvlJc w:val="left"/>
+      <w:pPr>
+        <w:tabs>
+          <w:tab w:pos="5040" w:val="num"/>
+        </w:tabs>
+        <w:ind w:hanging="480" w:left="5520"/>
+      </w:pPr>
+    </w:lvl>
+    <w:lvl w:ilvl="8">
+      <w:numFmt w:val="bullet"/>
+      <w:lvlText w:val=" "/>
+      <w:lvlJc w:val="left"/>
+      <w:pPr>
+        <w:tabs>
+          <w:tab w:pos="5760" w:val="num"/>
+        </w:tabs>
+        <w:ind w:hanging="480" w:left="6240"/>
+      </w:pPr>
+    </w:lvl>
+  </w:abstractNum>
   <w:abstractNum w:abstractNumId="990">
     <w:nsid w:val="0000A990"/>
     <w:multiLevelType w:val="multilevel"/>
@@ -8512,6 +10262,9 @@
       </w:rPr>
     </w:lvl>
   </w:abstractNum>
+  <w:num w16cid:durableId="1370180281" w:numId="1">
+    <w:abstractNumId w:val="0"/>
+  </w:num>
   <w:num w:numId="1000">
     <w:abstractNumId w:val="990"/>
   </w:num>
@@ -8589,130 +10342,20 @@
   <w:docDefaults>
     <w:rPrDefault>
       <w:rPr>
-        <w:rFonts w:ascii="Roboto" w:cs="Roboto" w:eastAsia="Roboto" w:hAnsi="Roboto"/>
-        <w:sz w:val="22"/>
-        <w:szCs w:val="22"/>
-        <w:lang w:bidi="ar-SA" w:eastAsia="en-US" w:val="en"/>
+        <w:rFonts w:asciiTheme="minorHAnsi" w:cstheme="minorBidi" w:eastAsiaTheme="minorHAnsi" w:hAnsiTheme="minorHAnsi"/>
+        <w:sz w:val="24"/>
+        <w:szCs w:val="24"/>
+        <w:lang w:bidi="ar-SA" w:eastAsia="en-US" w:val="en-US"/>
       </w:rPr>
     </w:rPrDefault>
     <w:pPrDefault>
       <w:pPr>
-        <w:spacing w:line="276" w:lineRule="auto"/>
+        <w:spacing w:after="200"/>
       </w:pPr>
     </w:pPrDefault>
   </w:docDefaults>
-  <w:latentStyles w:count="376" w:defLockedState="0" w:defQFormat="0" w:defSemiHidden="0" w:defUIPriority="99" w:defUnhideWhenUsed="0">
-    <w:lsdException w:name="Normal" w:qFormat="1" w:uiPriority="0"/>
-    <w:lsdException w:name="heading 1" w:qFormat="1" w:uiPriority="9"/>
-    <w:lsdException w:name="heading 2" w:qFormat="1" w:semiHidden="1" w:uiPriority="9" w:unhideWhenUsed="1"/>
-    <w:lsdException w:name="heading 3" w:qFormat="1" w:semiHidden="1" w:uiPriority="9" w:unhideWhenUsed="1"/>
-    <w:lsdException w:name="heading 4" w:qFormat="1" w:semiHidden="1" w:uiPriority="9" w:unhideWhenUsed="1"/>
-    <w:lsdException w:name="heading 5" w:qFormat="1" w:semiHidden="1" w:uiPriority="9" w:unhideWhenUsed="1"/>
-    <w:lsdException w:name="heading 6" w:qFormat="1" w:semiHidden="1" w:uiPriority="9" w:unhideWhenUsed="1"/>
-    <w:lsdException w:name="heading 7" w:qFormat="1" w:semiHidden="1" w:uiPriority="9" w:unhideWhenUsed="1"/>
-    <w:lsdException w:name="heading 8" w:qFormat="1" w:semiHidden="1" w:uiPriority="9" w:unhideWhenUsed="1"/>
-    <w:lsdException w:name="heading 9" w:qFormat="1" w:semiHidden="1" w:uiPriority="9" w:unhideWhenUsed="1"/>
-    <w:lsdException w:name="index 1" w:semiHidden="1" w:unhideWhenUsed="1"/>
-    <w:lsdException w:name="index 2" w:semiHidden="1" w:unhideWhenUsed="1"/>
-    <w:lsdException w:name="index 3" w:semiHidden="1" w:unhideWhenUsed="1"/>
-    <w:lsdException w:name="index 4" w:semiHidden="1" w:unhideWhenUsed="1"/>
-    <w:lsdException w:name="index 5" w:semiHidden="1" w:unhideWhenUsed="1"/>
-    <w:lsdException w:name="index 6" w:semiHidden="1" w:unhideWhenUsed="1"/>
-    <w:lsdException w:name="index 7" w:semiHidden="1" w:unhideWhenUsed="1"/>
-    <w:lsdException w:name="index 8" w:semiHidden="1" w:unhideWhenUsed="1"/>
-    <w:lsdException w:name="index 9" w:semiHidden="1" w:unhideWhenUsed="1"/>
-    <w:lsdException w:name="toc 1" w:semiHidden="1" w:uiPriority="39" w:unhideWhenUsed="1"/>
-    <w:lsdException w:name="toc 2" w:semiHidden="1" w:uiPriority="39" w:unhideWhenUsed="1"/>
-    <w:lsdException w:name="toc 3" w:semiHidden="1" w:uiPriority="39" w:unhideWhenUsed="1"/>
-    <w:lsdException w:name="toc 4" w:semiHidden="1" w:uiPriority="39" w:unhideWhenUsed="1"/>
-    <w:lsdException w:name="toc 5" w:semiHidden="1" w:uiPriority="39" w:unhideWhenUsed="1"/>
-    <w:lsdException w:name="toc 6" w:semiHidden="1" w:uiPriority="39" w:unhideWhenUsed="1"/>
-    <w:lsdException w:name="toc 7" w:semiHidden="1" w:uiPriority="39" w:unhideWhenUsed="1"/>
-    <w:lsdException w:name="toc 8" w:semiHidden="1" w:uiPriority="39" w:unhideWhenUsed="1"/>
-    <w:lsdException w:name="toc 9" w:semiHidden="1" w:uiPriority="39" w:unhideWhenUsed="1"/>
-    <w:lsdException w:name="Normal Indent" w:semiHidden="1" w:unhideWhenUsed="1"/>
-    <w:lsdException w:name="footnote text" w:semiHidden="1" w:unhideWhenUsed="1"/>
-    <w:lsdException w:name="annotation text" w:semiHidden="1" w:unhideWhenUsed="1"/>
-    <w:lsdException w:name="header" w:semiHidden="1" w:unhideWhenUsed="1"/>
-    <w:lsdException w:name="footer" w:semiHidden="1" w:unhideWhenUsed="1"/>
-    <w:lsdException w:name="index heading" w:semiHidden="1" w:unhideWhenUsed="1"/>
-    <w:lsdException w:name="caption" w:qFormat="1" w:semiHidden="1" w:uiPriority="35" w:unhideWhenUsed="1"/>
-    <w:lsdException w:name="table of figures" w:semiHidden="1" w:unhideWhenUsed="1"/>
-    <w:lsdException w:name="envelope address" w:semiHidden="1" w:unhideWhenUsed="1"/>
-    <w:lsdException w:name="envelope return" w:semiHidden="1" w:unhideWhenUsed="1"/>
-    <w:lsdException w:name="footnote reference" w:semiHidden="1" w:unhideWhenUsed="1"/>
-    <w:lsdException w:name="annotation reference" w:semiHidden="1" w:unhideWhenUsed="1"/>
-    <w:lsdException w:name="line number" w:semiHidden="1" w:unhideWhenUsed="1"/>
-    <w:lsdException w:name="page number" w:semiHidden="1" w:unhideWhenUsed="1"/>
-    <w:lsdException w:name="endnote reference" w:semiHidden="1" w:unhideWhenUsed="1"/>
-    <w:lsdException w:name="endnote text" w:semiHidden="1" w:unhideWhenUsed="1"/>
-    <w:lsdException w:name="table of authorities" w:semiHidden="1" w:unhideWhenUsed="1"/>
-    <w:lsdException w:name="macro" w:semiHidden="1" w:unhideWhenUsed="1"/>
-    <w:lsdException w:name="toa heading" w:semiHidden="1" w:unhideWhenUsed="1"/>
-    <w:lsdException w:name="List" w:semiHidden="1" w:unhideWhenUsed="1"/>
-    <w:lsdException w:name="List Bullet" w:semiHidden="1" w:unhideWhenUsed="1"/>
-    <w:lsdException w:name="List Number" w:semiHidden="1" w:unhideWhenUsed="1"/>
-    <w:lsdException w:name="List 2" w:semiHidden="1" w:unhideWhenUsed="1"/>
-    <w:lsdException w:name="List 3" w:semiHidden="1" w:unhideWhenUsed="1"/>
-    <w:lsdException w:name="List 4" w:semiHidden="1" w:unhideWhenUsed="1"/>
-    <w:lsdException w:name="List 5" w:semiHidden="1" w:unhideWhenUsed="1"/>
-    <w:lsdException w:name="List Bullet 2" w:semiHidden="1" w:unhideWhenUsed="1"/>
-    <w:lsdException w:name="List Bullet 3" w:semiHidden="1" w:unhideWhenUsed="1"/>
-    <w:lsdException w:name="List Bullet 4" w:semiHidden="1" w:unhideWhenUsed="1"/>
-    <w:lsdException w:name="List Bullet 5" w:semiHidden="1" w:unhideWhenUsed="1"/>
-    <w:lsdException w:name="List Number 2" w:semiHidden="1" w:unhideWhenUsed="1"/>
-    <w:lsdException w:name="List Number 3" w:semiHidden="1" w:unhideWhenUsed="1"/>
-    <w:lsdException w:name="List Number 4" w:semiHidden="1" w:unhideWhenUsed="1"/>
-    <w:lsdException w:name="List Number 5" w:semiHidden="1" w:unhideWhenUsed="1"/>
-    <w:lsdException w:name="Title" w:qFormat="1" w:uiPriority="10"/>
-    <w:lsdException w:name="Closing" w:semiHidden="1" w:unhideWhenUsed="1"/>
-    <w:lsdException w:name="Signature" w:semiHidden="1" w:unhideWhenUsed="1"/>
-    <w:lsdException w:name="Default Paragraph Font" w:semiHidden="1" w:uiPriority="1" w:unhideWhenUsed="1"/>
-    <w:lsdException w:name="Body Text" w:semiHidden="1" w:unhideWhenUsed="1"/>
-    <w:lsdException w:name="Body Text Indent" w:semiHidden="1" w:unhideWhenUsed="1"/>
-    <w:lsdException w:name="List Continue" w:semiHidden="1" w:unhideWhenUsed="1"/>
-    <w:lsdException w:name="List Continue 2" w:semiHidden="1" w:unhideWhenUsed="1"/>
-    <w:lsdException w:name="List Continue 3" w:semiHidden="1" w:unhideWhenUsed="1"/>
-    <w:lsdException w:name="List Continue 4" w:semiHidden="1" w:unhideWhenUsed="1"/>
-    <w:lsdException w:name="List Continue 5" w:semiHidden="1" w:unhideWhenUsed="1"/>
-    <w:lsdException w:name="Message Header" w:semiHidden="1" w:unhideWhenUsed="1"/>
-    <w:lsdException w:name="Subtitle" w:qFormat="1" w:uiPriority="11"/>
-    <w:lsdException w:name="Salutation" w:semiHidden="1" w:unhideWhenUsed="1"/>
-    <w:lsdException w:name="Date" w:semiHidden="1" w:unhideWhenUsed="1"/>
-    <w:lsdException w:name="Body Text First Indent" w:semiHidden="1" w:unhideWhenUsed="1"/>
-    <w:lsdException w:name="Body Text First Indent 2" w:semiHidden="1" w:unhideWhenUsed="1"/>
-    <w:lsdException w:name="Note Heading" w:semiHidden="1" w:unhideWhenUsed="1"/>
-    <w:lsdException w:name="Body Text 2" w:semiHidden="1" w:unhideWhenUsed="1"/>
-    <w:lsdException w:name="Body Text 3" w:semiHidden="1" w:unhideWhenUsed="1"/>
-    <w:lsdException w:name="Body Text Indent 2" w:semiHidden="1" w:unhideWhenUsed="1"/>
-    <w:lsdException w:name="Body Text Indent 3" w:semiHidden="1" w:unhideWhenUsed="1"/>
-    <w:lsdException w:name="Block Text" w:semiHidden="1" w:unhideWhenUsed="1"/>
-    <w:lsdException w:name="Hyperlink" w:semiHidden="1" w:unhideWhenUsed="1"/>
-    <w:lsdException w:name="FollowedHyperlink" w:semiHidden="1" w:unhideWhenUsed="1"/>
-    <w:lsdException w:name="Strong" w:qFormat="1" w:uiPriority="22"/>
-    <w:lsdException w:name="Emphasis" w:qFormat="1" w:uiPriority="20"/>
-    <w:lsdException w:name="Document Map" w:semiHidden="1" w:unhideWhenUsed="1"/>
-    <w:lsdException w:name="Plain Text" w:semiHidden="1" w:unhideWhenUsed="1"/>
-    <w:lsdException w:name="E-mail Signature" w:semiHidden="1" w:unhideWhenUsed="1"/>
-    <w:lsdException w:name="HTML Top of Form" w:semiHidden="1" w:unhideWhenUsed="1"/>
-    <w:lsdException w:name="HTML Bottom of Form" w:semiHidden="1" w:unhideWhenUsed="1"/>
-    <w:lsdException w:name="Normal (Web)" w:semiHidden="1" w:unhideWhenUsed="1"/>
-    <w:lsdException w:name="HTML Acronym" w:semiHidden="1" w:unhideWhenUsed="1"/>
-    <w:lsdException w:name="HTML Address" w:semiHidden="1" w:unhideWhenUsed="1"/>
-    <w:lsdException w:name="HTML Cite" w:semiHidden="1" w:unhideWhenUsed="1"/>
-    <w:lsdException w:name="HTML Code" w:semiHidden="1" w:unhideWhenUsed="1"/>
-    <w:lsdException w:name="HTML Definition" w:semiHidden="1" w:unhideWhenUsed="1"/>
-    <w:lsdException w:name="HTML Keyboard" w:semiHidden="1" w:unhideWhenUsed="1"/>
-    <w:lsdException w:name="HTML Preformatted" w:semiHidden="1" w:unhideWhenUsed="1"/>
-    <w:lsdException w:name="HTML Sample" w:semiHidden="1" w:unhideWhenUsed="1"/>
-    <w:lsdException w:name="HTML Typewriter" w:semiHidden="1" w:unhideWhenUsed="1"/>
-    <w:lsdException w:name="HTML Variable" w:semiHidden="1" w:unhideWhenUsed="1"/>
+  <w:latentStyles w:count="376" w:defLockedState="0" w:defQFormat="0" w:defSemiHidden="0" w:defUIPriority="0" w:defUnhideWhenUsed="0">
     <w:lsdException w:name="Normal Table" w:semiHidden="1" w:unhideWhenUsed="1"/>
-    <w:lsdException w:name="annotation subject" w:semiHidden="1" w:unhideWhenUsed="1"/>
-    <w:lsdException w:name="No List" w:semiHidden="1" w:unhideWhenUsed="1"/>
-    <w:lsdException w:name="Outline List 1" w:semiHidden="1" w:unhideWhenUsed="1"/>
-    <w:lsdException w:name="Outline List 2" w:semiHidden="1" w:unhideWhenUsed="1"/>
-    <w:lsdException w:name="Outline List 3" w:semiHidden="1" w:unhideWhenUsed="1"/>
     <w:lsdException w:name="Table Simple 1" w:semiHidden="1" w:unhideWhenUsed="1"/>
     <w:lsdException w:name="Table Simple 2" w:semiHidden="1" w:unhideWhenUsed="1"/>
     <w:lsdException w:name="Table Simple 3" w:semiHidden="1" w:unhideWhenUsed="1"/>
@@ -8755,129 +10398,105 @@
     <w:lsdException w:name="Table Web 1" w:semiHidden="1" w:unhideWhenUsed="1"/>
     <w:lsdException w:name="Table Web 2" w:semiHidden="1" w:unhideWhenUsed="1"/>
     <w:lsdException w:name="Table Web 3" w:semiHidden="1" w:unhideWhenUsed="1"/>
-    <w:lsdException w:name="Balloon Text" w:semiHidden="1" w:unhideWhenUsed="1"/>
-    <w:lsdException w:name="Table Grid" w:uiPriority="39"/>
     <w:lsdException w:name="Table Theme" w:semiHidden="1" w:unhideWhenUsed="1"/>
-    <w:lsdException w:name="Placeholder Text" w:semiHidden="1"/>
-    <w:lsdException w:name="No Spacing" w:qFormat="1" w:uiPriority="1"/>
-    <w:lsdException w:name="Light Shading" w:uiPriority="60"/>
-    <w:lsdException w:name="Light List" w:uiPriority="61"/>
-    <w:lsdException w:name="Light Grid" w:uiPriority="62"/>
-    <w:lsdException w:name="Medium Shading 1" w:uiPriority="63"/>
-    <w:lsdException w:name="Medium Shading 2" w:uiPriority="64"/>
-    <w:lsdException w:name="Medium List 1" w:uiPriority="65"/>
-    <w:lsdException w:name="Medium List 2" w:uiPriority="66"/>
-    <w:lsdException w:name="Medium Grid 1" w:uiPriority="67"/>
-    <w:lsdException w:name="Medium Grid 2" w:uiPriority="68"/>
-    <w:lsdException w:name="Medium Grid 3" w:uiPriority="69"/>
-    <w:lsdException w:name="Dark List" w:uiPriority="70"/>
-    <w:lsdException w:name="Colorful Shading" w:uiPriority="71"/>
-    <w:lsdException w:name="Colorful List" w:uiPriority="72"/>
-    <w:lsdException w:name="Colorful Grid" w:uiPriority="73"/>
-    <w:lsdException w:name="Light Shading Accent 1" w:uiPriority="60"/>
-    <w:lsdException w:name="Light List Accent 1" w:uiPriority="61"/>
-    <w:lsdException w:name="Light Grid Accent 1" w:uiPriority="62"/>
-    <w:lsdException w:name="Medium Shading 1 Accent 1" w:uiPriority="63"/>
-    <w:lsdException w:name="Medium Shading 2 Accent 1" w:uiPriority="64"/>
-    <w:lsdException w:name="Medium List 1 Accent 1" w:uiPriority="65"/>
-    <w:lsdException w:name="Revision" w:semiHidden="1"/>
-    <w:lsdException w:name="List Paragraph" w:qFormat="1" w:uiPriority="34"/>
-    <w:lsdException w:name="Quote" w:qFormat="1" w:uiPriority="29"/>
-    <w:lsdException w:name="Intense Quote" w:qFormat="1" w:uiPriority="30"/>
-    <w:lsdException w:name="Medium List 2 Accent 1" w:uiPriority="66"/>
-    <w:lsdException w:name="Medium Grid 1 Accent 1" w:uiPriority="67"/>
-    <w:lsdException w:name="Medium Grid 2 Accent 1" w:uiPriority="68"/>
-    <w:lsdException w:name="Medium Grid 3 Accent 1" w:uiPriority="69"/>
-    <w:lsdException w:name="Dark List Accent 1" w:uiPriority="70"/>
-    <w:lsdException w:name="Colorful Shading Accent 1" w:uiPriority="71"/>
-    <w:lsdException w:name="Colorful List Accent 1" w:uiPriority="72"/>
-    <w:lsdException w:name="Colorful Grid Accent 1" w:uiPriority="73"/>
-    <w:lsdException w:name="Light Shading Accent 2" w:uiPriority="60"/>
-    <w:lsdException w:name="Light List Accent 2" w:uiPriority="61"/>
-    <w:lsdException w:name="Light Grid Accent 2" w:uiPriority="62"/>
-    <w:lsdException w:name="Medium Shading 1 Accent 2" w:uiPriority="63"/>
-    <w:lsdException w:name="Medium Shading 2 Accent 2" w:uiPriority="64"/>
-    <w:lsdException w:name="Medium List 1 Accent 2" w:uiPriority="65"/>
-    <w:lsdException w:name="Medium List 2 Accent 2" w:uiPriority="66"/>
-    <w:lsdException w:name="Medium Grid 1 Accent 2" w:uiPriority="67"/>
-    <w:lsdException w:name="Medium Grid 2 Accent 2" w:uiPriority="68"/>
-    <w:lsdException w:name="Medium Grid 3 Accent 2" w:uiPriority="69"/>
-    <w:lsdException w:name="Dark List Accent 2" w:uiPriority="70"/>
-    <w:lsdException w:name="Colorful Shading Accent 2" w:uiPriority="71"/>
-    <w:lsdException w:name="Colorful List Accent 2" w:uiPriority="72"/>
-    <w:lsdException w:name="Colorful Grid Accent 2" w:uiPriority="73"/>
-    <w:lsdException w:name="Light Shading Accent 3" w:uiPriority="60"/>
-    <w:lsdException w:name="Light List Accent 3" w:uiPriority="61"/>
-    <w:lsdException w:name="Light Grid Accent 3" w:uiPriority="62"/>
-    <w:lsdException w:name="Medium Shading 1 Accent 3" w:uiPriority="63"/>
-    <w:lsdException w:name="Medium Shading 2 Accent 3" w:uiPriority="64"/>
-    <w:lsdException w:name="Medium List 1 Accent 3" w:uiPriority="65"/>
-    <w:lsdException w:name="Medium List 2 Accent 3" w:uiPriority="66"/>
-    <w:lsdException w:name="Medium Grid 1 Accent 3" w:uiPriority="67"/>
-    <w:lsdException w:name="Medium Grid 2 Accent 3" w:uiPriority="68"/>
-    <w:lsdException w:name="Medium Grid 3 Accent 3" w:uiPriority="69"/>
-    <w:lsdException w:name="Dark List Accent 3" w:uiPriority="70"/>
-    <w:lsdException w:name="Colorful Shading Accent 3" w:uiPriority="71"/>
-    <w:lsdException w:name="Colorful List Accent 3" w:uiPriority="72"/>
-    <w:lsdException w:name="Colorful Grid Accent 3" w:uiPriority="73"/>
-    <w:lsdException w:name="Light Shading Accent 4" w:uiPriority="60"/>
-    <w:lsdException w:name="Light List Accent 4" w:uiPriority="61"/>
-    <w:lsdException w:name="Light Grid Accent 4" w:uiPriority="62"/>
-    <w:lsdException w:name="Medium Shading 1 Accent 4" w:uiPriority="63"/>
-    <w:lsdException w:name="Medium Shading 2 Accent 4" w:uiPriority="64"/>
-    <w:lsdException w:name="Medium List 1 Accent 4" w:uiPriority="65"/>
-    <w:lsdException w:name="Medium List 2 Accent 4" w:uiPriority="66"/>
-    <w:lsdException w:name="Medium Grid 1 Accent 4" w:uiPriority="67"/>
-    <w:lsdException w:name="Medium Grid 2 Accent 4" w:uiPriority="68"/>
-    <w:lsdException w:name="Medium Grid 3 Accent 4" w:uiPriority="69"/>
-    <w:lsdException w:name="Dark List Accent 4" w:uiPriority="70"/>
-    <w:lsdException w:name="Colorful Shading Accent 4" w:uiPriority="71"/>
-    <w:lsdException w:name="Colorful List Accent 4" w:uiPriority="72"/>
-    <w:lsdException w:name="Colorful Grid Accent 4" w:uiPriority="73"/>
-    <w:lsdException w:name="Light Shading Accent 5" w:uiPriority="60"/>
-    <w:lsdException w:name="Light List Accent 5" w:uiPriority="61"/>
-    <w:lsdException w:name="Light Grid Accent 5" w:uiPriority="62"/>
-    <w:lsdException w:name="Medium Shading 1 Accent 5" w:uiPriority="63"/>
-    <w:lsdException w:name="Medium Shading 2 Accent 5" w:uiPriority="64"/>
-    <w:lsdException w:name="Medium List 1 Accent 5" w:uiPriority="65"/>
-    <w:lsdException w:name="Medium List 2 Accent 5" w:uiPriority="66"/>
-    <w:lsdException w:name="Medium Grid 1 Accent 5" w:uiPriority="67"/>
-    <w:lsdException w:name="Medium Grid 2 Accent 5" w:uiPriority="68"/>
-    <w:lsdException w:name="Medium Grid 3 Accent 5" w:uiPriority="69"/>
-    <w:lsdException w:name="Dark List Accent 5" w:uiPriority="70"/>
-    <w:lsdException w:name="Colorful Shading Accent 5" w:uiPriority="71"/>
-    <w:lsdException w:name="Colorful List Accent 5" w:uiPriority="72"/>
-    <w:lsdException w:name="Colorful Grid Accent 5" w:uiPriority="73"/>
-    <w:lsdException w:name="Light Shading Accent 6" w:uiPriority="60"/>
-    <w:lsdException w:name="Light List Accent 6" w:uiPriority="61"/>
-    <w:lsdException w:name="Light Grid Accent 6" w:uiPriority="62"/>
-    <w:lsdException w:name="Medium Shading 1 Accent 6" w:uiPriority="63"/>
-    <w:lsdException w:name="Medium Shading 2 Accent 6" w:uiPriority="64"/>
-    <w:lsdException w:name="Medium List 1 Accent 6" w:uiPriority="65"/>
-    <w:lsdException w:name="Medium List 2 Accent 6" w:uiPriority="66"/>
-    <w:lsdException w:name="Medium Grid 1 Accent 6" w:uiPriority="67"/>
-    <w:lsdException w:name="Medium Grid 2 Accent 6" w:uiPriority="68"/>
-    <w:lsdException w:name="Medium Grid 3 Accent 6" w:uiPriority="69"/>
-    <w:lsdException w:name="Dark List Accent 6" w:uiPriority="70"/>
-    <w:lsdException w:name="Colorful Shading Accent 6" w:uiPriority="71"/>
-    <w:lsdException w:name="Colorful List Accent 6" w:uiPriority="72"/>
-    <w:lsdException w:name="Colorful Grid Accent 6" w:uiPriority="73"/>
-    <w:lsdException w:name="Subtle Emphasis" w:qFormat="1" w:uiPriority="19"/>
-    <w:lsdException w:name="Intense Emphasis" w:qFormat="1" w:uiPriority="21"/>
-    <w:lsdException w:name="Subtle Reference" w:qFormat="1" w:uiPriority="31"/>
-    <w:lsdException w:name="Intense Reference" w:qFormat="1" w:uiPriority="32"/>
-    <w:lsdException w:name="Book Title" w:qFormat="1" w:uiPriority="33"/>
-    <w:lsdException w:name="Bibliography" w:semiHidden="1" w:uiPriority="37" w:unhideWhenUsed="1"/>
-    <w:lsdException w:name="TOC Heading" w:qFormat="1" w:semiHidden="1" w:uiPriority="39" w:unhideWhenUsed="1"/>
-    <w:lsdException w:name="Plain Table 1" w:uiPriority="41"/>
-    <w:lsdException w:name="Plain Table 2" w:uiPriority="42"/>
-    <w:lsdException w:name="Plain Table 3" w:uiPriority="43"/>
-    <w:lsdException w:name="Plain Table 4" w:uiPriority="44"/>
-    <w:lsdException w:name="Plain Table 5" w:uiPriority="45"/>
-    <w:lsdException w:name="Grid Table Light" w:uiPriority="40"/>
-    <w:lsdException w:name="Grid Table 1 Light" w:uiPriority="46"/>
-    <w:lsdException w:name="Grid Table 2" w:uiPriority="47"/>
-    <w:lsdException w:name="Grid Table 3" w:uiPriority="48"/>
+    <w:lsdException w:name="Light Shading"/>
+    <w:lsdException w:name="Light List"/>
+    <w:lsdException w:name="Light Grid"/>
+    <w:lsdException w:name="Medium Shading 1"/>
+    <w:lsdException w:name="Medium Shading 2"/>
+    <w:lsdException w:name="Medium List 1"/>
+    <w:lsdException w:name="Medium List 2"/>
+    <w:lsdException w:name="Medium Grid 1"/>
+    <w:lsdException w:name="Medium Grid 2"/>
+    <w:lsdException w:name="Medium Grid 3"/>
+    <w:lsdException w:name="Dark List"/>
+    <w:lsdException w:name="Colorful Shading"/>
+    <w:lsdException w:name="Colorful List"/>
+    <w:lsdException w:name="Colorful Grid"/>
+    <w:lsdException w:name="Light Shading Accent 1"/>
+    <w:lsdException w:name="Light List Accent 1"/>
+    <w:lsdException w:name="Light Grid Accent 1"/>
+    <w:lsdException w:name="Medium Shading 1 Accent 1"/>
+    <w:lsdException w:name="Medium Shading 2 Accent 1"/>
+    <w:lsdException w:name="Medium List 1 Accent 1"/>
+    <w:lsdException w:name="Medium List 2 Accent 1"/>
+    <w:lsdException w:name="Medium Grid 1 Accent 1"/>
+    <w:lsdException w:name="Medium Grid 2 Accent 1"/>
+    <w:lsdException w:name="Medium Grid 3 Accent 1"/>
+    <w:lsdException w:name="Dark List Accent 1"/>
+    <w:lsdException w:name="Colorful Shading Accent 1"/>
+    <w:lsdException w:name="Colorful List Accent 1"/>
+    <w:lsdException w:name="Colorful Grid Accent 1"/>
+    <w:lsdException w:name="Light Shading Accent 2"/>
+    <w:lsdException w:name="Light List Accent 2"/>
+    <w:lsdException w:name="Light Grid Accent 2"/>
+    <w:lsdException w:name="Medium Shading 1 Accent 2"/>
+    <w:lsdException w:name="Medium Shading 2 Accent 2"/>
+    <w:lsdException w:name="Medium List 1 Accent 2"/>
+    <w:lsdException w:name="Medium List 2 Accent 2"/>
+    <w:lsdException w:name="Medium Grid 1 Accent 2"/>
+    <w:lsdException w:name="Medium Grid 2 Accent 2"/>
+    <w:lsdException w:name="Medium Grid 3 Accent 2"/>
+    <w:lsdException w:name="Dark List Accent 2"/>
+    <w:lsdException w:name="Colorful Shading Accent 2"/>
+    <w:lsdException w:name="Colorful List Accent 2"/>
+    <w:lsdException w:name="Colorful Grid Accent 2"/>
+    <w:lsdException w:name="Light Shading Accent 3"/>
+    <w:lsdException w:name="Light List Accent 3"/>
+    <w:lsdException w:name="Light Grid Accent 3"/>
+    <w:lsdException w:name="Medium Shading 1 Accent 3"/>
+    <w:lsdException w:name="Medium Shading 2 Accent 3"/>
+    <w:lsdException w:name="Medium List 1 Accent 3"/>
+    <w:lsdException w:name="Medium List 2 Accent 3"/>
+    <w:lsdException w:name="Medium Grid 1 Accent 3"/>
+    <w:lsdException w:name="Medium Grid 2 Accent 3"/>
+    <w:lsdException w:name="Medium Grid 3 Accent 3"/>
+    <w:lsdException w:name="Dark List Accent 3"/>
+    <w:lsdException w:name="Colorful Shading Accent 3"/>
+    <w:lsdException w:name="Colorful List Accent 3"/>
+    <w:lsdException w:name="Colorful Grid Accent 3"/>
+    <w:lsdException w:name="Light Shading Accent 4"/>
+    <w:lsdException w:name="Light List Accent 4"/>
+    <w:lsdException w:name="Light Grid Accent 4"/>
+    <w:lsdException w:name="Medium Shading 1 Accent 4"/>
+    <w:lsdException w:name="Medium Shading 2 Accent 4"/>
+    <w:lsdException w:name="Medium List 1 Accent 4"/>
+    <w:lsdException w:name="Medium List 2 Accent 4"/>
+    <w:lsdException w:name="Medium Grid 1 Accent 4"/>
+    <w:lsdException w:name="Medium Grid 2 Accent 4"/>
+    <w:lsdException w:name="Medium Grid 3 Accent 4"/>
+    <w:lsdException w:name="Dark List Accent 4"/>
+    <w:lsdException w:name="Colorful Shading Accent 4"/>
+    <w:lsdException w:name="Colorful List Accent 4"/>
+    <w:lsdException w:name="Colorful Grid Accent 4"/>
+    <w:lsdException w:name="Light Shading Accent 5"/>
+    <w:lsdException w:name="Light List Accent 5"/>
+    <w:lsdException w:name="Light Grid Accent 5"/>
+    <w:lsdException w:name="Medium Shading 1 Accent 5"/>
+    <w:lsdException w:name="Medium Shading 2 Accent 5"/>
+    <w:lsdException w:name="Medium List 1 Accent 5"/>
+    <w:lsdException w:name="Medium List 2 Accent 5"/>
+    <w:lsdException w:name="Medium Grid 1 Accent 5"/>
+    <w:lsdException w:name="Medium Grid 2 Accent 5"/>
+    <w:lsdException w:name="Medium Grid 3 Accent 5"/>
+    <w:lsdException w:name="Dark List Accent 5"/>
+    <w:lsdException w:name="Colorful Shading Accent 5"/>
+    <w:lsdException w:name="Colorful List Accent 5"/>
+    <w:lsdException w:name="Colorful Grid Accent 5"/>
+    <w:lsdException w:name="Light Shading Accent 6"/>
+    <w:lsdException w:name="Light List Accent 6"/>
+    <w:lsdException w:name="Light Grid Accent 6"/>
+    <w:lsdException w:name="Medium Shading 1 Accent 6"/>
+    <w:lsdException w:name="Medium Shading 2 Accent 6"/>
+    <w:lsdException w:name="Medium List 1 Accent 6"/>
+    <w:lsdException w:name="Medium List 2 Accent 6"/>
+    <w:lsdException w:name="Medium Grid 1 Accent 6"/>
+    <w:lsdException w:name="Medium Grid 2 Accent 6"/>
+    <w:lsdException w:name="Medium Grid 3 Accent 6"/>
+    <w:lsdException w:name="Dark List Accent 6"/>
+    <w:lsdException w:name="Colorful Shading Accent 6"/>
+    <w:lsdException w:name="Colorful List Accent 6"/>
+    <w:lsdException w:name="Colorful Grid Accent 6"/>
     <w:lsdException w:name="Grid Table 4" w:uiPriority="49"/>
     <w:lsdException w:name="Grid Table 5 Dark" w:uiPriority="50"/>
     <w:lsdException w:name="Grid Table 6 Colorful" w:uiPriority="51"/>
@@ -8973,11 +10592,11 @@
     <w:lsdException w:name="List Table 5 Dark Accent 6" w:uiPriority="50"/>
     <w:lsdException w:name="List Table 6 Colorful Accent 6" w:uiPriority="51"/>
     <w:lsdException w:name="List Table 7 Colorful Accent 6" w:uiPriority="52"/>
-    <w:lsdException w:name="Mention" w:semiHidden="1" w:unhideWhenUsed="1"/>
-    <w:lsdException w:name="Smart Hyperlink" w:semiHidden="1" w:unhideWhenUsed="1"/>
-    <w:lsdException w:name="Hashtag" w:semiHidden="1" w:unhideWhenUsed="1"/>
-    <w:lsdException w:name="Unresolved Mention" w:semiHidden="1" w:unhideWhenUsed="1"/>
-    <w:lsdException w:name="Smart Link" w:semiHidden="1" w:unhideWhenUsed="1"/>
+    <w:lsdException w:name="Mention" w:semiHidden="1" w:uiPriority="99" w:unhideWhenUsed="1"/>
+    <w:lsdException w:name="Smart Hyperlink" w:semiHidden="1" w:uiPriority="99" w:unhideWhenUsed="1"/>
+    <w:lsdException w:name="Hashtag" w:semiHidden="1" w:uiPriority="99" w:unhideWhenUsed="1"/>
+    <w:lsdException w:name="Unresolved Mention" w:semiHidden="1" w:uiPriority="99" w:unhideWhenUsed="1"/>
+    <w:lsdException w:name="Smart Link" w:semiHidden="1" w:uiPriority="99" w:unhideWhenUsed="1"/>
   </w:latentStyles>
   <w:style w:default="1" w:styleId="Normal" w:type="paragraph">
     <w:name w:val="Normal"/>
@@ -8986,19 +10605,20 @@
   <w:style w:styleId="Heading1" w:type="paragraph">
     <w:name w:val="heading 1"/>
     <w:basedOn w:val="Normal"/>
-    <w:next w:val="Normal"/>
+    <w:next w:val="BodyText"/>
+    <w:link w:val="Heading1Char"/>
     <w:uiPriority w:val="9"/>
     <w:qFormat/>
+    <w:rsid w:val="00A10FD9"/>
     <w:pPr>
       <w:keepNext/>
       <w:keepLines/>
-      <w:spacing w:after="120" w:before="400"/>
+      <w:spacing w:after="80" w:before="360"/>
       <w:outlineLvl w:val="0"/>
     </w:pPr>
     <w:rPr>
-      <w:rFonts w:ascii="Montserrat" w:cs="Montserrat" w:eastAsia="Montserrat" w:hAnsi="Montserrat"/>
-      <w:b/>
-      <w:bCs/>
+      <w:rFonts w:asciiTheme="majorHAnsi" w:cstheme="majorBidi" w:eastAsiaTheme="majorEastAsia" w:hAnsiTheme="majorHAnsi"/>
+      <w:color w:themeColor="accent1" w:themeShade="BF" w:val="0F4761"/>
       <w:sz w:val="40"/>
       <w:szCs w:val="40"/>
     </w:rPr>
@@ -9006,21 +10626,22 @@
   <w:style w:styleId="Heading2" w:type="paragraph">
     <w:name w:val="heading 2"/>
     <w:basedOn w:val="Normal"/>
-    <w:next w:val="Normal"/>
+    <w:next w:val="BodyText"/>
+    <w:link w:val="Heading2Char"/>
     <w:uiPriority w:val="9"/>
     <w:semiHidden/>
     <w:unhideWhenUsed/>
     <w:qFormat/>
+    <w:rsid w:val="00A10FD9"/>
     <w:pPr>
       <w:keepNext/>
       <w:keepLines/>
-      <w:spacing w:after="120" w:before="360"/>
+      <w:spacing w:after="80" w:before="160"/>
       <w:outlineLvl w:val="1"/>
     </w:pPr>
     <w:rPr>
-      <w:rFonts w:ascii="Montserrat" w:cs="Montserrat" w:eastAsia="Montserrat" w:hAnsi="Montserrat"/>
-      <w:b/>
-      <w:bCs/>
+      <w:rFonts w:asciiTheme="majorHAnsi" w:cstheme="majorBidi" w:eastAsiaTheme="majorEastAsia" w:hAnsiTheme="majorHAnsi"/>
+      <w:color w:themeColor="accent1" w:themeShade="BF" w:val="0F4761"/>
       <w:sz w:val="32"/>
       <w:szCs w:val="32"/>
     </w:rPr>
@@ -9028,22 +10649,22 @@
   <w:style w:styleId="Heading3" w:type="paragraph">
     <w:name w:val="heading 3"/>
     <w:basedOn w:val="Normal"/>
-    <w:next w:val="Normal"/>
+    <w:next w:val="BodyText"/>
+    <w:link w:val="Heading3Char"/>
     <w:uiPriority w:val="9"/>
     <w:semiHidden/>
     <w:unhideWhenUsed/>
     <w:qFormat/>
+    <w:rsid w:val="00A10FD9"/>
     <w:pPr>
       <w:keepNext/>
       <w:keepLines/>
-      <w:spacing w:after="80" w:before="320"/>
+      <w:spacing w:after="80" w:before="160"/>
       <w:outlineLvl w:val="2"/>
     </w:pPr>
     <w:rPr>
-      <w:rFonts w:ascii="Montserrat" w:cs="Montserrat" w:eastAsia="Montserrat" w:hAnsi="Montserrat"/>
-      <w:b/>
-      <w:bCs/>
-      <w:color w:val="434343"/>
+      <w:rFonts w:cstheme="majorBidi" w:eastAsiaTheme="majorEastAsia"/>
+      <w:color w:themeColor="accent1" w:themeShade="BF" w:val="0F4761"/>
       <w:sz w:val="28"/>
       <w:szCs w:val="28"/>
     </w:rPr>
@@ -9051,59 +10672,133 @@
   <w:style w:styleId="Heading4" w:type="paragraph">
     <w:name w:val="heading 4"/>
     <w:basedOn w:val="Normal"/>
-    <w:next w:val="Normal"/>
+    <w:next w:val="BodyText"/>
+    <w:link w:val="Heading4Char"/>
     <w:uiPriority w:val="9"/>
     <w:semiHidden/>
     <w:unhideWhenUsed/>
     <w:qFormat/>
+    <w:rsid w:val="00A10FD9"/>
     <w:pPr>
       <w:keepNext/>
       <w:keepLines/>
-      <w:spacing w:after="80" w:before="280"/>
+      <w:spacing w:after="40" w:before="80"/>
       <w:outlineLvl w:val="3"/>
     </w:pPr>
     <w:rPr>
-      <w:color w:val="666666"/>
-      <w:sz w:val="24"/>
-      <w:szCs w:val="24"/>
+      <w:rFonts w:cstheme="majorBidi" w:eastAsiaTheme="majorEastAsia"/>
+      <w:i/>
+      <w:iCs/>
+      <w:color w:themeColor="accent1" w:themeShade="BF" w:val="0F4761"/>
     </w:rPr>
   </w:style>
   <w:style w:styleId="Heading5" w:type="paragraph">
     <w:name w:val="heading 5"/>
     <w:basedOn w:val="Normal"/>
-    <w:next w:val="Normal"/>
+    <w:next w:val="BodyText"/>
+    <w:link w:val="Heading5Char"/>
     <w:uiPriority w:val="9"/>
     <w:semiHidden/>
     <w:unhideWhenUsed/>
     <w:qFormat/>
+    <w:rsid w:val="00A10FD9"/>
     <w:pPr>
       <w:keepNext/>
       <w:keepLines/>
-      <w:spacing w:after="80" w:before="240"/>
+      <w:spacing w:after="40" w:before="80"/>
       <w:outlineLvl w:val="4"/>
     </w:pPr>
     <w:rPr>
-      <w:color w:val="666666"/>
+      <w:rFonts w:cstheme="majorBidi" w:eastAsiaTheme="majorEastAsia"/>
+      <w:color w:themeColor="accent1" w:themeShade="BF" w:val="0F4761"/>
     </w:rPr>
   </w:style>
   <w:style w:styleId="Heading6" w:type="paragraph">
     <w:name w:val="heading 6"/>
     <w:basedOn w:val="Normal"/>
-    <w:next w:val="Normal"/>
+    <w:next w:val="BodyText"/>
+    <w:link w:val="Heading6Char"/>
     <w:uiPriority w:val="9"/>
     <w:semiHidden/>
     <w:unhideWhenUsed/>
     <w:qFormat/>
+    <w:rsid w:val="00A10FD9"/>
     <w:pPr>
       <w:keepNext/>
       <w:keepLines/>
-      <w:spacing w:after="80" w:before="240"/>
+      <w:spacing w:after="0" w:before="40"/>
       <w:outlineLvl w:val="5"/>
     </w:pPr>
     <w:rPr>
+      <w:rFonts w:cstheme="majorBidi" w:eastAsiaTheme="majorEastAsia"/>
       <w:i/>
       <w:iCs/>
-      <w:color w:val="666666"/>
+      <w:color w:themeColor="text1" w:themeTint="A6" w:val="595959"/>
+    </w:rPr>
+  </w:style>
+  <w:style w:styleId="Heading7" w:type="paragraph">
+    <w:name w:val="heading 7"/>
+    <w:basedOn w:val="Normal"/>
+    <w:next w:val="BodyText"/>
+    <w:link w:val="Heading7Char"/>
+    <w:uiPriority w:val="9"/>
+    <w:semiHidden/>
+    <w:unhideWhenUsed/>
+    <w:qFormat/>
+    <w:rsid w:val="00A10FD9"/>
+    <w:pPr>
+      <w:keepNext/>
+      <w:keepLines/>
+      <w:spacing w:after="0" w:before="40"/>
+      <w:outlineLvl w:val="6"/>
+    </w:pPr>
+    <w:rPr>
+      <w:rFonts w:cstheme="majorBidi" w:eastAsiaTheme="majorEastAsia"/>
+      <w:color w:themeColor="text1" w:themeTint="A6" w:val="595959"/>
+    </w:rPr>
+  </w:style>
+  <w:style w:styleId="Heading8" w:type="paragraph">
+    <w:name w:val="heading 8"/>
+    <w:basedOn w:val="Normal"/>
+    <w:next w:val="BodyText"/>
+    <w:link w:val="Heading8Char"/>
+    <w:uiPriority w:val="9"/>
+    <w:semiHidden/>
+    <w:unhideWhenUsed/>
+    <w:qFormat/>
+    <w:rsid w:val="00A10FD9"/>
+    <w:pPr>
+      <w:keepNext/>
+      <w:keepLines/>
+      <w:spacing w:after="0"/>
+      <w:outlineLvl w:val="7"/>
+    </w:pPr>
+    <w:rPr>
+      <w:rFonts w:cstheme="majorBidi" w:eastAsiaTheme="majorEastAsia"/>
+      <w:i/>
+      <w:iCs/>
+      <w:color w:themeColor="text1" w:themeTint="D8" w:val="272727"/>
+    </w:rPr>
+  </w:style>
+  <w:style w:styleId="Heading9" w:type="paragraph">
+    <w:name w:val="heading 9"/>
+    <w:basedOn w:val="Normal"/>
+    <w:next w:val="BodyText"/>
+    <w:link w:val="Heading9Char"/>
+    <w:uiPriority w:val="9"/>
+    <w:semiHidden/>
+    <w:unhideWhenUsed/>
+    <w:qFormat/>
+    <w:rsid w:val="00A10FD9"/>
+    <w:pPr>
+      <w:keepNext/>
+      <w:keepLines/>
+      <w:spacing w:after="0"/>
+      <w:outlineLvl w:val="8"/>
+    </w:pPr>
+    <w:rPr>
+      <w:rFonts w:cstheme="majorBidi" w:eastAsiaTheme="majorEastAsia"/>
+      <w:color w:themeColor="text1" w:themeTint="D8" w:val="272727"/>
     </w:rPr>
   </w:style>
   <w:style w:default="1" w:styleId="DefaultParagraphFont" w:type="character">
@@ -9133,97 +10828,429 @@
     <w:semiHidden/>
     <w:unhideWhenUsed/>
   </w:style>
-  <w:style w:customStyle="1" w:styleId="TableNormal0" w:type="table">
-    <w:name w:val="TableNormal"/>
-    <w:tblPr>
-      <w:tblCellMar>
-        <w:top w:type="dxa" w:w="100"/>
-        <w:left w:type="dxa" w:w="100"/>
-        <w:bottom w:type="dxa" w:w="100"/>
-        <w:right w:type="dxa" w:w="100"/>
-      </w:tblCellMar>
-    </w:tblPr>
+  <w:style w:styleId="BodyText" w:type="paragraph">
+    <w:name w:val="Body Text"/>
+    <w:basedOn w:val="Normal"/>
+    <w:qFormat/>
+    <w:pPr>
+      <w:spacing w:after="180" w:before="180"/>
+    </w:pPr>
+  </w:style>
+  <w:style w:customStyle="1" w:styleId="FirstParagraph" w:type="paragraph">
+    <w:name w:val="First Paragraph"/>
+    <w:basedOn w:val="BodyText"/>
+    <w:next w:val="BodyText"/>
+    <w:qFormat/>
+  </w:style>
+  <w:style w:customStyle="1" w:styleId="Compact" w:type="paragraph">
+    <w:name w:val="Compact"/>
+    <w:basedOn w:val="BodyText"/>
+    <w:qFormat/>
+    <w:pPr>
+      <w:spacing w:after="36" w:before="36"/>
+    </w:pPr>
   </w:style>
   <w:style w:styleId="Title" w:type="paragraph">
     <w:name w:val="Title"/>
     <w:basedOn w:val="Normal"/>
-    <w:next w:val="Normal"/>
+    <w:next w:val="BodyText"/>
+    <w:link w:val="TitleChar"/>
     <w:uiPriority w:val="10"/>
+    <w:qFormat/>
+    <w:rsid w:val="00A10FD9"/>
+    <w:pPr>
+      <w:spacing w:after="80"/>
+      <w:contextualSpacing/>
+      <w:jc w:val="center"/>
+    </w:pPr>
+    <w:rPr>
+      <w:rFonts w:asciiTheme="majorHAnsi" w:cstheme="majorBidi" w:eastAsiaTheme="majorEastAsia" w:hAnsiTheme="majorHAnsi"/>
+      <w:spacing w:val="-10"/>
+      <w:kern w:val="28"/>
+      <w:sz w:val="56"/>
+      <w:szCs w:val="56"/>
+    </w:rPr>
+  </w:style>
+  <w:style w:customStyle="1" w:styleId="TitleChar" w:type="character">
+    <w:name w:val="Title Char"/>
+    <w:basedOn w:val="DefaultParagraphFont"/>
+    <w:link w:val="Title"/>
+    <w:uiPriority w:val="10"/>
+    <w:rsid w:val="00A10FD9"/>
+    <w:rPr>
+      <w:rFonts w:asciiTheme="majorHAnsi" w:cstheme="majorBidi" w:eastAsiaTheme="majorEastAsia" w:hAnsiTheme="majorHAnsi"/>
+      <w:spacing w:val="-10"/>
+      <w:kern w:val="28"/>
+      <w:sz w:val="56"/>
+      <w:szCs w:val="56"/>
+    </w:rPr>
+  </w:style>
+  <w:style w:styleId="Subtitle" w:type="paragraph">
+    <w:name w:val="Subtitle"/>
+    <w:basedOn w:val="Title"/>
+    <w:next w:val="BodyText"/>
+    <w:link w:val="SubtitleChar"/>
+    <w:uiPriority w:val="11"/>
+    <w:qFormat/>
+    <w:rsid w:val="00A10FD9"/>
+    <w:pPr>
+      <w:numPr>
+        <w:ilvl w:val="1"/>
+      </w:numPr>
+    </w:pPr>
+    <w:rPr>
+      <w:spacing w:val="15"/>
+      <w:sz w:val="28"/>
+      <w:szCs w:val="28"/>
+    </w:rPr>
+  </w:style>
+  <w:style w:customStyle="1" w:styleId="SubtitleChar" w:type="character">
+    <w:name w:val="Subtitle Char"/>
+    <w:basedOn w:val="DefaultParagraphFont"/>
+    <w:link w:val="Subtitle"/>
+    <w:uiPriority w:val="11"/>
+    <w:rsid w:val="00A10FD9"/>
+    <w:rPr>
+      <w:rFonts w:cstheme="majorBidi" w:eastAsiaTheme="majorEastAsia"/>
+      <w:color w:themeColor="text1" w:themeTint="A6" w:val="595959"/>
+      <w:spacing w:val="15"/>
+      <w:sz w:val="28"/>
+      <w:szCs w:val="28"/>
+    </w:rPr>
+  </w:style>
+  <w:style w:customStyle="1" w:styleId="Author" w:type="paragraph">
+    <w:name w:val="Author"/>
+    <w:next w:val="BodyText"/>
     <w:qFormat/>
     <w:pPr>
       <w:keepNext/>
       <w:keepLines/>
-      <w:spacing w:after="60"/>
+      <w:jc w:val="center"/>
     </w:pPr>
-    <w:rPr>
-      <w:rFonts w:ascii="Montserrat" w:cs="Montserrat" w:eastAsia="Montserrat" w:hAnsi="Montserrat"/>
-      <w:b/>
-      <w:bCs/>
-      <w:sz w:val="52"/>
-      <w:szCs w:val="52"/>
-    </w:rPr>
   </w:style>
-  <w:style w:styleId="Subtitle" w:type="paragraph">
-    <w:name w:val="Subtitle"/>
-    <w:basedOn w:val="Normal"/>
-    <w:next w:val="Normal"/>
-    <w:uiPriority w:val="11"/>
+  <w:style w:styleId="Date" w:type="paragraph">
+    <w:name w:val="Date"/>
+    <w:next w:val="BodyText"/>
     <w:qFormat/>
     <w:pPr>
       <w:keepNext/>
       <w:keepLines/>
-      <w:spacing w:after="320"/>
+      <w:jc w:val="center"/>
+    </w:pPr>
+  </w:style>
+  <w:style w:customStyle="1" w:styleId="AbstractTitle" w:type="paragraph">
+    <w:name w:val="Abstract Title"/>
+    <w:basedOn w:val="Normal"/>
+    <w:next w:val="Abstract"/>
+    <w:qFormat/>
+    <w:pPr>
+      <w:keepNext/>
+      <w:keepLines/>
+      <w:spacing w:after="0" w:before="300"/>
+      <w:jc w:val="center"/>
     </w:pPr>
     <w:rPr>
-      <w:rFonts w:ascii="Roboto Medium" w:cs="Roboto Medium" w:eastAsia="Roboto Medium" w:hAnsi="Roboto Medium"/>
-      <w:color w:val="666666"/>
-      <w:sz w:val="30"/>
-      <w:szCs w:val="30"/>
+      <w:b/>
+      <w:sz w:val="20"/>
+      <w:szCs w:val="20"/>
     </w:rPr>
   </w:style>
-  <w:style w:styleId="Header" w:type="paragraph">
-    <w:name w:val="header"/>
+  <w:style w:customStyle="1" w:styleId="Abstract" w:type="paragraph">
+    <w:name w:val="Abstract"/>
     <w:basedOn w:val="Normal"/>
-    <w:link w:val="HeaderChar"/>
-    <w:uiPriority w:val="99"/>
+    <w:next w:val="BodyText"/>
+    <w:qFormat/>
+    <w:pPr>
+      <w:keepNext/>
+      <w:keepLines/>
+      <w:spacing w:after="300" w:before="100"/>
+    </w:pPr>
+    <w:rPr>
+      <w:sz w:val="20"/>
+      <w:szCs w:val="20"/>
+    </w:rPr>
+  </w:style>
+  <w:style w:styleId="Bibliography" w:type="paragraph">
+    <w:name w:val="Bibliography"/>
+    <w:basedOn w:val="Normal"/>
+    <w:qFormat/>
+  </w:style>
+  <w:style w:customStyle="1" w:styleId="Heading1Char" w:type="character">
+    <w:name w:val="Heading 1 Char"/>
+    <w:basedOn w:val="DefaultParagraphFont"/>
+    <w:link w:val="Heading1"/>
+    <w:uiPriority w:val="9"/>
+    <w:rsid w:val="00A10FD9"/>
+    <w:rPr>
+      <w:rFonts w:asciiTheme="majorHAnsi" w:cstheme="majorBidi" w:eastAsiaTheme="majorEastAsia" w:hAnsiTheme="majorHAnsi"/>
+      <w:color w:themeColor="accent1" w:themeShade="BF" w:val="0F4761"/>
+      <w:sz w:val="40"/>
+      <w:szCs w:val="40"/>
+    </w:rPr>
+  </w:style>
+  <w:style w:customStyle="1" w:styleId="Heading2Char" w:type="character">
+    <w:name w:val="Heading 2 Char"/>
+    <w:basedOn w:val="DefaultParagraphFont"/>
+    <w:link w:val="Heading2"/>
+    <w:uiPriority w:val="9"/>
+    <w:semiHidden/>
+    <w:rsid w:val="00A10FD9"/>
+    <w:rPr>
+      <w:rFonts w:asciiTheme="majorHAnsi" w:cstheme="majorBidi" w:eastAsiaTheme="majorEastAsia" w:hAnsiTheme="majorHAnsi"/>
+      <w:color w:themeColor="accent1" w:themeShade="BF" w:val="0F4761"/>
+      <w:sz w:val="32"/>
+      <w:szCs w:val="32"/>
+    </w:rPr>
+  </w:style>
+  <w:style w:customStyle="1" w:styleId="Heading3Char" w:type="character">
+    <w:name w:val="Heading 3 Char"/>
+    <w:basedOn w:val="DefaultParagraphFont"/>
+    <w:link w:val="Heading3"/>
+    <w:uiPriority w:val="9"/>
+    <w:semiHidden/>
+    <w:rsid w:val="00A10FD9"/>
+    <w:rPr>
+      <w:rFonts w:cstheme="majorBidi" w:eastAsiaTheme="majorEastAsia"/>
+      <w:color w:themeColor="accent1" w:themeShade="BF" w:val="0F4761"/>
+      <w:sz w:val="28"/>
+      <w:szCs w:val="28"/>
+    </w:rPr>
+  </w:style>
+  <w:style w:customStyle="1" w:styleId="Heading4Char" w:type="character">
+    <w:name w:val="Heading 4 Char"/>
+    <w:basedOn w:val="DefaultParagraphFont"/>
+    <w:link w:val="Heading4"/>
+    <w:uiPriority w:val="9"/>
+    <w:semiHidden/>
+    <w:rsid w:val="00A10FD9"/>
+    <w:rPr>
+      <w:rFonts w:cstheme="majorBidi" w:eastAsiaTheme="majorEastAsia"/>
+      <w:i/>
+      <w:iCs/>
+      <w:color w:themeColor="accent1" w:themeShade="BF" w:val="0F4761"/>
+    </w:rPr>
+  </w:style>
+  <w:style w:customStyle="1" w:styleId="Heading5Char" w:type="character">
+    <w:name w:val="Heading 5 Char"/>
+    <w:basedOn w:val="DefaultParagraphFont"/>
+    <w:link w:val="Heading5"/>
+    <w:uiPriority w:val="9"/>
+    <w:semiHidden/>
+    <w:rsid w:val="00A10FD9"/>
+    <w:rPr>
+      <w:rFonts w:cstheme="majorBidi" w:eastAsiaTheme="majorEastAsia"/>
+      <w:color w:themeColor="accent1" w:themeShade="BF" w:val="0F4761"/>
+    </w:rPr>
+  </w:style>
+  <w:style w:customStyle="1" w:styleId="Heading6Char" w:type="character">
+    <w:name w:val="Heading 6 Char"/>
+    <w:basedOn w:val="DefaultParagraphFont"/>
+    <w:link w:val="Heading6"/>
+    <w:uiPriority w:val="9"/>
+    <w:semiHidden/>
+    <w:rsid w:val="00A10FD9"/>
+    <w:rPr>
+      <w:rFonts w:cstheme="majorBidi" w:eastAsiaTheme="majorEastAsia"/>
+      <w:i/>
+      <w:iCs/>
+      <w:color w:themeColor="text1" w:themeTint="A6" w:val="595959"/>
+    </w:rPr>
+  </w:style>
+  <w:style w:customStyle="1" w:styleId="Heading7Char" w:type="character">
+    <w:name w:val="Heading 7 Char"/>
+    <w:basedOn w:val="DefaultParagraphFont"/>
+    <w:link w:val="Heading7"/>
+    <w:uiPriority w:val="9"/>
+    <w:semiHidden/>
+    <w:rsid w:val="00A10FD9"/>
+    <w:rPr>
+      <w:rFonts w:cstheme="majorBidi" w:eastAsiaTheme="majorEastAsia"/>
+      <w:color w:themeColor="text1" w:themeTint="A6" w:val="595959"/>
+    </w:rPr>
+  </w:style>
+  <w:style w:customStyle="1" w:styleId="Heading8Char" w:type="character">
+    <w:name w:val="Heading 8 Char"/>
+    <w:basedOn w:val="DefaultParagraphFont"/>
+    <w:link w:val="Heading8"/>
+    <w:uiPriority w:val="9"/>
+    <w:semiHidden/>
+    <w:rsid w:val="00A10FD9"/>
+    <w:rPr>
+      <w:rFonts w:cstheme="majorBidi" w:eastAsiaTheme="majorEastAsia"/>
+      <w:i/>
+      <w:iCs/>
+      <w:color w:themeColor="text1" w:themeTint="D8" w:val="272727"/>
+    </w:rPr>
+  </w:style>
+  <w:style w:customStyle="1" w:styleId="Heading9Char" w:type="character">
+    <w:name w:val="Heading 9 Char"/>
+    <w:basedOn w:val="DefaultParagraphFont"/>
+    <w:link w:val="Heading9"/>
+    <w:uiPriority w:val="9"/>
+    <w:semiHidden/>
+    <w:rsid w:val="00A10FD9"/>
+    <w:rPr>
+      <w:rFonts w:cstheme="majorBidi" w:eastAsiaTheme="majorEastAsia"/>
+      <w:color w:themeColor="text1" w:themeTint="D8" w:val="272727"/>
+    </w:rPr>
+  </w:style>
+  <w:style w:styleId="BlockText" w:type="paragraph">
+    <w:name w:val="Block Text"/>
+    <w:basedOn w:val="BodyText"/>
+    <w:next w:val="BodyText"/>
+    <w:uiPriority w:val="9"/>
     <w:unhideWhenUsed/>
-    <w:rsid w:val="00400E98"/>
+    <w:qFormat/>
     <w:pPr>
-      <w:tabs>
-        <w:tab w:pos="4680" w:val="center"/>
-        <w:tab w:pos="9360" w:val="right"/>
-      </w:tabs>
-      <w:spacing w:line="240" w:lineRule="auto"/>
+      <w:spacing w:after="100" w:before="100"/>
+      <w:ind w:left="480" w:right="480"/>
     </w:pPr>
   </w:style>
-  <w:style w:customStyle="1" w:styleId="HeaderChar" w:type="character">
-    <w:name w:val="Header Char"/>
-    <w:basedOn w:val="DefaultParagraphFont"/>
-    <w:link w:val="Header"/>
-    <w:uiPriority w:val="99"/>
-    <w:rsid w:val="00400E98"/>
+  <w:style w:styleId="FootnoteText" w:type="paragraph">
+    <w:name w:val="footnote text"/>
+    <w:basedOn w:val="Normal"/>
+    <w:uiPriority w:val="9"/>
+    <w:unhideWhenUsed/>
+    <w:qFormat/>
+    <w:rsid w:val="0065612A"/>
+    <w:rPr>
+      <w:sz w:val="20"/>
+    </w:rPr>
   </w:style>
-  <w:style w:styleId="Footer" w:type="paragraph">
-    <w:name w:val="footer"/>
-    <w:basedOn w:val="Normal"/>
-    <w:link w:val="FooterChar"/>
-    <w:uiPriority w:val="99"/>
+  <w:style w:customStyle="1" w:styleId="FootnoteBlockText" w:type="paragraph">
+    <w:name w:val="Footnote Block Text"/>
+    <w:basedOn w:val="FootnoteText"/>
+    <w:next w:val="FootnoteText"/>
+    <w:uiPriority w:val="9"/>
     <w:unhideWhenUsed/>
-    <w:rsid w:val="00400E98"/>
+    <w:qFormat/>
     <w:pPr>
-      <w:tabs>
-        <w:tab w:pos="4680" w:val="center"/>
-        <w:tab w:pos="9360" w:val="right"/>
-      </w:tabs>
-      <w:spacing w:line="240" w:lineRule="auto"/>
+      <w:spacing w:after="100" w:before="100"/>
+      <w:ind w:left="480" w:right="480"/>
     </w:pPr>
   </w:style>
-  <w:style w:customStyle="1" w:styleId="FooterChar" w:type="character">
-    <w:name w:val="Footer Char"/>
+  <w:style w:customStyle="1" w:styleId="Table" w:type="table">
+    <w:name w:val="Table"/>
+    <w:semiHidden/>
+    <w:unhideWhenUsed/>
+    <w:qFormat/>
+    <w:tblPr>
+      <w:tblInd w:type="dxa" w:w="0"/>
+      <w:tblCellMar>
+        <w:top w:type="dxa" w:w="0"/>
+        <w:left w:type="dxa" w:w="108"/>
+        <w:bottom w:type="dxa" w:w="0"/>
+        <w:right w:type="dxa" w:w="108"/>
+      </w:tblCellMar>
+    </w:tblPr>
+    <w:tblStylePr w:type="firstRow">
+      <w:tblPr>
+        <w:jc w:val="left"/>
+      </w:tblPr>
+      <w:trPr>
+        <w:jc w:val="left"/>
+      </w:trPr>
+      <w:tcPr>
+        <w:tcBorders>
+          <w:bottom w:color="auto" w:space="0" w:sz="0" w:val="single"/>
+        </w:tcBorders>
+        <w:vAlign w:val="bottom"/>
+      </w:tcPr>
+    </w:tblStylePr>
+  </w:style>
+  <w:style w:customStyle="1" w:styleId="DefinitionTerm" w:type="paragraph">
+    <w:name w:val="Definition Term"/>
+    <w:basedOn w:val="Normal"/>
+    <w:next w:val="Definition"/>
+    <w:pPr>
+      <w:keepNext/>
+      <w:keepLines/>
+      <w:spacing w:after="0"/>
+    </w:pPr>
+    <w:rPr>
+      <w:b/>
+    </w:rPr>
+  </w:style>
+  <w:style w:customStyle="1" w:styleId="Definition" w:type="paragraph">
+    <w:name w:val="Definition"/>
+    <w:basedOn w:val="Normal"/>
+  </w:style>
+  <w:style w:styleId="Caption" w:type="paragraph">
+    <w:name w:val="caption"/>
+    <w:basedOn w:val="Normal"/>
+    <w:link w:val="CaptionChar"/>
+    <w:pPr>
+      <w:spacing w:after="120"/>
+    </w:pPr>
+    <w:rPr>
+      <w:i/>
+    </w:rPr>
+  </w:style>
+  <w:style w:customStyle="1" w:styleId="TableCaption" w:type="paragraph">
+    <w:name w:val="Table Caption"/>
+    <w:basedOn w:val="Caption"/>
+    <w:pPr>
+      <w:keepNext/>
+    </w:pPr>
+  </w:style>
+  <w:style w:customStyle="1" w:styleId="ImageCaption" w:type="paragraph">
+    <w:name w:val="Image Caption"/>
+    <w:basedOn w:val="Caption"/>
+  </w:style>
+  <w:style w:customStyle="1" w:styleId="Figure" w:type="paragraph">
+    <w:name w:val="Figure"/>
+    <w:basedOn w:val="Normal"/>
+  </w:style>
+  <w:style w:customStyle="1" w:styleId="CaptionedFigure" w:type="paragraph">
+    <w:name w:val="Captioned Figure"/>
+    <w:basedOn w:val="Figure"/>
+    <w:pPr>
+      <w:keepNext/>
+    </w:pPr>
+  </w:style>
+  <w:style w:customStyle="1" w:styleId="CaptionChar" w:type="character">
+    <w:name w:val="Caption Char"/>
     <w:basedOn w:val="DefaultParagraphFont"/>
-    <w:link w:val="Footer"/>
-    <w:uiPriority w:val="99"/>
-    <w:rsid w:val="00400E98"/>
+    <w:link w:val="Caption"/>
+  </w:style>
+  <w:style w:customStyle="1" w:styleId="VerbatimChar" w:type="character">
+    <w:name w:val="Verbatim Char"/>
+    <w:basedOn w:val="CaptionChar"/>
+    <w:rsid w:val="0065612A"/>
+    <w:rPr>
+      <w:rFonts w:ascii="Consolas" w:hAnsi="Consolas"/>
+      <w:sz w:val="20"/>
+    </w:rPr>
+  </w:style>
+  <w:style w:customStyle="1" w:styleId="SectionNumber" w:type="character">
+    <w:name w:val="Section Number"/>
+    <w:basedOn w:val="CaptionChar"/>
+  </w:style>
+  <w:style w:styleId="FootnoteReference" w:type="character">
+    <w:name w:val="footnote reference"/>
+    <w:basedOn w:val="CaptionChar"/>
+    <w:rPr>
+      <w:vertAlign w:val="superscript"/>
+    </w:rPr>
+  </w:style>
+  <w:style w:styleId="Hyperlink" w:type="character">
+    <w:name w:val="Hyperlink"/>
+    <w:basedOn w:val="CaptionChar"/>
+    <w:rPr>
+      <w:color w:themeColor="accent1" w:val="156082"/>
+    </w:rPr>
+  </w:style>
+  <w:style w:styleId="TOCHeading" w:type="paragraph">
+    <w:name w:val="TOC Heading"/>
+    <w:basedOn w:val="Heading1"/>
+    <w:next w:val="BodyText"/>
+    <w:uiPriority w:val="39"/>
+    <w:unhideWhenUsed/>
+    <w:qFormat/>
+    <w:pPr>
+      <w:spacing w:before="240" w:line="259" w:lineRule="auto"/>
+      <w:outlineLvl w:val="9"/>
+    </w:pPr>
   </w:style>
   <w:style w:type="paragraph" w:customStyle="1" w:styleId="SourceCode">
     <w:name w:val="Source Code"/>
@@ -9501,44 +11528,44 @@
         <a:sysClr val="window" lastClr="FFFFFF"/>
       </a:lt1>
       <a:dk2>
-        <a:srgbClr val="1F497D"/>
+        <a:srgbClr val="0E2841"/>
       </a:dk2>
       <a:lt2>
-        <a:srgbClr val="EEECE1"/>
+        <a:srgbClr val="E8E8E8"/>
       </a:lt2>
       <a:accent1>
-        <a:srgbClr val="4F81BD"/>
+        <a:srgbClr val="156082"/>
       </a:accent1>
       <a:accent2>
-        <a:srgbClr val="C0504D"/>
+        <a:srgbClr val="E97132"/>
       </a:accent2>
       <a:accent3>
-        <a:srgbClr val="9BBB59"/>
+        <a:srgbClr val="196B24"/>
       </a:accent3>
       <a:accent4>
-        <a:srgbClr val="8064A2"/>
+        <a:srgbClr val="0F9ED5"/>
       </a:accent4>
       <a:accent5>
-        <a:srgbClr val="4BACC6"/>
+        <a:srgbClr val="A02B93"/>
       </a:accent5>
       <a:accent6>
-        <a:srgbClr val="F79646"/>
+        <a:srgbClr val="4EA72E"/>
       </a:accent6>
       <a:hlink>
-        <a:srgbClr val="0000FF"/>
+        <a:srgbClr val="467886"/>
       </a:hlink>
       <a:folHlink>
-        <a:srgbClr val="800080"/>
+        <a:srgbClr val="96607D"/>
       </a:folHlink>
     </a:clrScheme>
     <a:fontScheme name="Office">
       <a:majorFont>
-        <a:latin typeface="Calibri"/>
+        <a:latin typeface="Aptos Display" panose="02110004020202020204"/>
         <a:ea typeface=""/>
         <a:cs typeface=""/>
-        <a:font script="Jpan" typeface="ＭＳ ゴシック"/>
+        <a:font script="Jpan" typeface="游ゴシック Light"/>
         <a:font script="Hang" typeface="맑은 고딕"/>
-        <a:font script="Hans" typeface="宋体"/>
+        <a:font script="Hans" typeface="等线 Light"/>
         <a:font script="Hant" typeface="新細明體"/>
         <a:font script="Arab" typeface="Times New Roman"/>
         <a:font script="Hebr" typeface="Times New Roman"/>
@@ -9566,14 +11593,31 @@
         <a:font script="Viet" typeface="Times New Roman"/>
         <a:font script="Uigh" typeface="Microsoft Uighur"/>
         <a:font script="Geor" typeface="Sylfaen"/>
+        <a:font script="Armn" typeface="Arial"/>
+        <a:font script="Bugi" typeface="Leelawadee UI"/>
+        <a:font script="Bopo" typeface="Microsoft JhengHei"/>
+        <a:font script="Java" typeface="Javanese Text"/>
+        <a:font script="Lisu" typeface="Segoe UI"/>
+        <a:font script="Mymr" typeface="Myanmar Text"/>
+        <a:font script="Nkoo" typeface="Ebrima"/>
+        <a:font script="Olck" typeface="Nirmala UI"/>
+        <a:font script="Osma" typeface="Ebrima"/>
+        <a:font script="Phag" typeface="Phagspa"/>
+        <a:font script="Syrn" typeface="Estrangelo Edessa"/>
+        <a:font script="Syrj" typeface="Estrangelo Edessa"/>
+        <a:font script="Syre" typeface="Estrangelo Edessa"/>
+        <a:font script="Sora" typeface="Nirmala UI"/>
+        <a:font script="Tale" typeface="Microsoft Tai Le"/>
+        <a:font script="Talu" typeface="Microsoft New Tai Lue"/>
+        <a:font script="Tfng" typeface="Ebrima"/>
       </a:majorFont>
       <a:minorFont>
-        <a:latin typeface="Cambria"/>
+        <a:latin typeface="Aptos" panose="02110004020202020204"/>
         <a:ea typeface=""/>
         <a:cs typeface=""/>
-        <a:font script="Jpan" typeface="ＭＳ 明朝"/>
+        <a:font script="Jpan" typeface="游明朝"/>
         <a:font script="Hang" typeface="맑은 고딕"/>
-        <a:font script="Hans" typeface="宋体"/>
+        <a:font script="Hans" typeface="等线"/>
         <a:font script="Hant" typeface="新細明體"/>
         <a:font script="Arab" typeface="Arial"/>
         <a:font script="Hebr" typeface="Arial"/>
@@ -9601,6 +11645,23 @@
         <a:font script="Viet" typeface="Arial"/>
         <a:font script="Uigh" typeface="Microsoft Uighur"/>
         <a:font script="Geor" typeface="Sylfaen"/>
+        <a:font script="Armn" typeface="Arial"/>
+        <a:font script="Bugi" typeface="Leelawadee UI"/>
+        <a:font script="Bopo" typeface="Microsoft JhengHei"/>
+        <a:font script="Java" typeface="Javanese Text"/>
+        <a:font script="Lisu" typeface="Segoe UI"/>
+        <a:font script="Mymr" typeface="Myanmar Text"/>
+        <a:font script="Nkoo" typeface="Ebrima"/>
+        <a:font script="Olck" typeface="Nirmala UI"/>
+        <a:font script="Osma" typeface="Ebrima"/>
+        <a:font script="Phag" typeface="Phagspa"/>
+        <a:font script="Syrn" typeface="Estrangelo Edessa"/>
+        <a:font script="Syrj" typeface="Estrangelo Edessa"/>
+        <a:font script="Syre" typeface="Estrangelo Edessa"/>
+        <a:font script="Sora" typeface="Nirmala UI"/>
+        <a:font script="Tale" typeface="Microsoft Tai Le"/>
+        <a:font script="Talu" typeface="Microsoft New Tai Lue"/>
+        <a:font script="Tfng" typeface="Ebrima"/>
       </a:minorFont>
     </a:fontScheme>
     <a:fmtScheme name="Office">
@@ -9612,200 +11673,141 @@
           <a:gsLst>
             <a:gs pos="0">
               <a:schemeClr val="phClr">
-                <a:tint val="50000"/>
-                <a:satMod val="300000"/>
+                <a:lumMod val="110000"/>
+                <a:satMod val="105000"/>
+                <a:tint val="67000"/>
               </a:schemeClr>
             </a:gs>
-            <a:gs pos="35000">
+            <a:gs pos="50000">
               <a:schemeClr val="phClr">
-                <a:tint val="37000"/>
-                <a:satMod val="300000"/>
+                <a:lumMod val="105000"/>
+                <a:satMod val="103000"/>
+                <a:tint val="73000"/>
               </a:schemeClr>
             </a:gs>
             <a:gs pos="100000">
               <a:schemeClr val="phClr">
-                <a:tint val="15000"/>
-                <a:satMod val="350000"/>
+                <a:lumMod val="105000"/>
+                <a:satMod val="109000"/>
+                <a:tint val="81000"/>
               </a:schemeClr>
             </a:gs>
           </a:gsLst>
-          <a:lin ang="16200000" scaled="1"/>
+          <a:lin ang="5400000" scaled="0"/>
         </a:gradFill>
         <a:gradFill rotWithShape="1">
           <a:gsLst>
             <a:gs pos="0">
               <a:schemeClr val="phClr">
-                <a:tint val="100000"/>
+                <a:satMod val="103000"/>
+                <a:lumMod val="102000"/>
+                <a:tint val="94000"/>
+              </a:schemeClr>
+            </a:gs>
+            <a:gs pos="50000">
+              <a:schemeClr val="phClr">
+                <a:satMod val="110000"/>
+                <a:lumMod val="100000"/>
                 <a:shade val="100000"/>
-                <a:satMod val="130000"/>
               </a:schemeClr>
             </a:gs>
             <a:gs pos="100000">
               <a:schemeClr val="phClr">
-                <a:tint val="50000"/>
-                <a:shade val="100000"/>
-                <a:satMod val="350000"/>
+                <a:lumMod val="99000"/>
+                <a:satMod val="120000"/>
+                <a:shade val="78000"/>
               </a:schemeClr>
             </a:gs>
           </a:gsLst>
-          <a:lin ang="16200000" scaled="0"/>
+          <a:lin ang="5400000" scaled="0"/>
         </a:gradFill>
       </a:fillStyleLst>
       <a:lnStyleLst>
-        <a:ln w="9525" cap="flat" cmpd="sng" algn="ctr">
-          <a:solidFill>
-            <a:schemeClr val="phClr">
-              <a:shade val="95000"/>
-              <a:satMod val="105000"/>
-            </a:schemeClr>
-          </a:solidFill>
-          <a:prstDash val="solid"/>
-        </a:ln>
-        <a:ln w="25400" cap="flat" cmpd="sng" algn="ctr">
+        <a:ln w="6350" cap="flat" cmpd="sng" algn="ctr">
           <a:solidFill>
             <a:schemeClr val="phClr"/>
           </a:solidFill>
           <a:prstDash val="solid"/>
+          <a:miter lim="800000"/>
         </a:ln>
-        <a:ln w="38100" cap="flat" cmpd="sng" algn="ctr">
+        <a:ln w="12700" cap="flat" cmpd="sng" algn="ctr">
           <a:solidFill>
             <a:schemeClr val="phClr"/>
           </a:solidFill>
           <a:prstDash val="solid"/>
+          <a:miter lim="800000"/>
+        </a:ln>
+        <a:ln w="19050" cap="flat" cmpd="sng" algn="ctr">
+          <a:solidFill>
+            <a:schemeClr val="phClr"/>
+          </a:solidFill>
+          <a:prstDash val="solid"/>
+          <a:miter lim="800000"/>
         </a:ln>
       </a:lnStyleLst>
       <a:effectStyleLst>
         <a:effectStyle>
+          <a:effectLst/>
+        </a:effectStyle>
+        <a:effectStyle>
+          <a:effectLst/>
+        </a:effectStyle>
+        <a:effectStyle>
           <a:effectLst>
-            <a:outerShdw blurRad="40000" dist="20000" dir="5400000" rotWithShape="0">
+            <a:outerShdw blurRad="57150" dist="19050" dir="5400000" algn="ctr" rotWithShape="0">
               <a:srgbClr val="000000">
-                <a:alpha val="38000"/>
+                <a:alpha val="63000"/>
               </a:srgbClr>
             </a:outerShdw>
           </a:effectLst>
-        </a:effectStyle>
-        <a:effectStyle>
-          <a:effectLst>
-            <a:outerShdw blurRad="40000" dist="23000" dir="5400000" rotWithShape="0">
-              <a:srgbClr val="000000">
-                <a:alpha val="35000"/>
-              </a:srgbClr>
-            </a:outerShdw>
-          </a:effectLst>
-        </a:effectStyle>
-        <a:effectStyle>
-          <a:effectLst>
-            <a:outerShdw blurRad="40000" dist="23000" dir="5400000" rotWithShape="0">
-              <a:srgbClr val="000000">
-                <a:alpha val="35000"/>
-              </a:srgbClr>
-            </a:outerShdw>
-          </a:effectLst>
-          <a:scene3d>
-            <a:camera prst="orthographicFront">
-              <a:rot lat="0" lon="0" rev="0"/>
-            </a:camera>
-            <a:lightRig rig="threePt" dir="t">
-              <a:rot lat="0" lon="0" rev="1200000"/>
-            </a:lightRig>
-          </a:scene3d>
-          <a:sp3d>
-            <a:bevelT w="63500" h="25400"/>
-          </a:sp3d>
         </a:effectStyle>
       </a:effectStyleLst>
       <a:bgFillStyleLst>
         <a:solidFill>
           <a:schemeClr val="phClr"/>
         </a:solidFill>
+        <a:solidFill>
+          <a:schemeClr val="phClr">
+            <a:tint val="95000"/>
+            <a:satMod val="170000"/>
+          </a:schemeClr>
+        </a:solidFill>
         <a:gradFill rotWithShape="1">
           <a:gsLst>
             <a:gs pos="0">
               <a:schemeClr val="phClr">
-                <a:tint val="40000"/>
-                <a:satMod val="350000"/>
+                <a:tint val="93000"/>
+                <a:satMod val="150000"/>
+                <a:shade val="98000"/>
+                <a:lumMod val="102000"/>
               </a:schemeClr>
             </a:gs>
-            <a:gs pos="40000">
+            <a:gs pos="50000">
               <a:schemeClr val="phClr">
-                <a:tint val="45000"/>
-                <a:shade val="99000"/>
-                <a:satMod val="350000"/>
+                <a:tint val="98000"/>
+                <a:satMod val="130000"/>
+                <a:shade val="90000"/>
+                <a:lumMod val="103000"/>
               </a:schemeClr>
             </a:gs>
             <a:gs pos="100000">
               <a:schemeClr val="phClr">
-                <a:shade val="20000"/>
-                <a:satMod val="255000"/>
+                <a:shade val="63000"/>
+                <a:satMod val="120000"/>
               </a:schemeClr>
             </a:gs>
           </a:gsLst>
-          <a:path path="circle">
-            <a:fillToRect l="50000" t="-80000" r="50000" b="180000"/>
-          </a:path>
-        </a:gradFill>
-        <a:gradFill rotWithShape="1">
-          <a:gsLst>
-            <a:gs pos="0">
-              <a:schemeClr val="phClr">
-                <a:tint val="80000"/>
-                <a:satMod val="300000"/>
-              </a:schemeClr>
-            </a:gs>
-            <a:gs pos="100000">
-              <a:schemeClr val="phClr">
-                <a:shade val="30000"/>
-                <a:satMod val="200000"/>
-              </a:schemeClr>
-            </a:gs>
-          </a:gsLst>
-          <a:path path="circle">
-            <a:fillToRect l="50000" t="50000" r="50000" b="50000"/>
-          </a:path>
+          <a:lin ang="5400000" scaled="0"/>
         </a:gradFill>
       </a:bgFillStyleLst>
     </a:fmtScheme>
   </a:themeElements>
-  <a:objectDefaults>
-    <a:spDef>
-      <a:spPr/>
-      <a:bodyPr/>
-      <a:lstStyle/>
-      <a:style>
-        <a:lnRef idx="1">
-          <a:schemeClr val="accent1"/>
-        </a:lnRef>
-        <a:fillRef idx="3">
-          <a:schemeClr val="accent1"/>
-        </a:fillRef>
-        <a:effectRef idx="2">
-          <a:schemeClr val="accent1"/>
-        </a:effectRef>
-        <a:fontRef idx="minor">
-          <a:schemeClr val="lt1"/>
-        </a:fontRef>
-      </a:style>
-    </a:spDef>
-    <a:lnDef>
-      <a:spPr/>
-      <a:bodyPr/>
-      <a:lstStyle/>
-      <a:style>
-        <a:lnRef idx="2">
-          <a:schemeClr val="accent1"/>
-        </a:lnRef>
-        <a:fillRef idx="0">
-          <a:schemeClr val="accent1"/>
-        </a:fillRef>
-        <a:effectRef idx="1">
-          <a:schemeClr val="accent1"/>
-        </a:effectRef>
-        <a:fontRef idx="minor">
-          <a:schemeClr val="tx1"/>
-        </a:fontRef>
-      </a:style>
-    </a:lnDef>
-  </a:objectDefaults>
+  <a:objectDefaults/>
   <a:extraClrSchemeLst/>
+  <a:extLst>
+    <a:ext uri="{05A4C25C-085E-4340-85A3-A5531E510DB2}">
+      <thm15:themeFamily xmlns:thm15="http://schemas.microsoft.com/office/thememl/2012/main" name="Office Theme" id="{2E142A2C-CD16-42D6-873A-C26D2A0506FA}" vid="{1BDDFF52-6CD6-40A5-AB3C-68EB2F1E4D0A}"/>
+    </a:ext>
+  </a:extLst>
 </a:theme>
 </file>
</xml_diff>